<commit_message>
Duku folytatas, PT win server konfig
Dokumentacio kiegeszitese a szerver konfigokkal, PT-ben win HTTP server konfig, index.html elkeszitese
</commit_message>
<xml_diff>
--- a/projektfeladat.docx
+++ b/projektfeladat.docx
@@ -220,6 +220,8 @@
       <w:pPr>
         <w:ind w:left="850.3937007874017" w:firstLine="0"/>
         <w:rPr>
+          <w:b w:val="1"/>
+          <w:bCs w:val="1"/>
           <w:sz w:val="28"/>
           <w:szCs w:val="28"/>
         </w:rPr>
@@ -233,322 +235,71 @@
     <w:p>
       <w:pPr>
         <w:ind w:left="850.3937007874017" w:firstLine="0"/>
-        <w:rPr/>
-      </w:pPr>
-      <w:r>
-        <w:rPr>
-          <w:rtl w:val="0"/>
-        </w:rPr>
-      </w:r>
-    </w:p>
-    <w:p>
-      <w:pPr>
-        <w:ind w:left="850.3937007874017" w:firstLine="0"/>
-        <w:rPr/>
-      </w:pPr>
-      <w:r>
-        <w:rPr>
-          <w:rtl w:val="0"/>
-        </w:rPr>
-        <w:t xml:space="preserve">Pécs: Központi telephely. </w:t>
-      </w:r>
-    </w:p>
-    <w:p>
-      <w:pPr>
-        <w:ind w:left="850.3937007874017" w:firstLine="0"/>
-        <w:rPr/>
-      </w:pPr>
-      <w:r>
-        <w:rPr>
-          <w:rtl w:val="0"/>
-        </w:rPr>
-        <w:t xml:space="preserve">R1 csatlakozik bérelt vonalakon a mohácsi R2-höz és a szigetvári R3-hoz. </w:t>
-      </w:r>
-    </w:p>
-    <w:p>
-      <w:pPr>
-        <w:ind w:left="850.3937007874017" w:firstLine="0"/>
-        <w:rPr/>
-      </w:pPr>
-      <w:r>
-        <w:rPr>
-          <w:rtl w:val="0"/>
-        </w:rPr>
-        <w:t xml:space="preserve">G0/0 porton az ASA0 biztosítja a publikus internet kapcsolatot egy kábelmodem segítségével. </w:t>
-      </w:r>
-    </w:p>
-    <w:p>
-      <w:pPr>
-        <w:ind w:left="850.3937007874017" w:firstLine="0"/>
-        <w:rPr/>
-      </w:pPr>
-      <w:r>
-        <w:rPr>
-          <w:rtl w:val="0"/>
-        </w:rPr>
-        <w:t xml:space="preserve">G0/1-en csatlakozik a core switch (SW10), trönk porton VLAN10..13 </w:t>
-      </w:r>
-    </w:p>
-    <w:p>
-      <w:pPr>
-        <w:ind w:left="850.3937007874017" w:firstLine="0"/>
-        <w:rPr/>
-      </w:pPr>
-      <w:r>
-        <w:rPr>
-          <w:rtl w:val="0"/>
-        </w:rPr>
-      </w:r>
-    </w:p>
-    <w:p>
-      <w:pPr>
-        <w:ind w:left="850.3937007874017" w:firstLine="0"/>
-        <w:rPr/>
-      </w:pPr>
-      <w:r>
         <w:rPr>
           <w:b w:val="1"/>
           <w:bCs w:val="1"/>
-          <w:rtl w:val="0"/>
-        </w:rPr>
-        <w:t xml:space="preserve">VLANok</w:t>
-      </w:r>
-      <w:r>
-        <w:rPr>
-          <w:rtl w:val="0"/>
-        </w:rPr>
-        <w:t xml:space="preserve">:</w:t>
-      </w:r>
-    </w:p>
-    <w:p>
-      <w:pPr>
-        <w:ind w:left="850.3937007874017" w:firstLine="0"/>
-        <w:rPr/>
-      </w:pPr>
-      <w:r>
-        <w:rPr>
-          <w:rtl w:val="0"/>
-        </w:rPr>
-        <w:t xml:space="preserve">10: szerverek, switchek</w:t>
-      </w:r>
-    </w:p>
-    <w:p>
-      <w:pPr>
-        <w:ind w:left="850.3937007874017" w:firstLine="0"/>
-        <w:rPr/>
-      </w:pPr>
-      <w:r>
-        <w:rPr>
-          <w:rtl w:val="0"/>
-        </w:rPr>
-        <w:t xml:space="preserve">11: iroda</w:t>
-      </w:r>
-    </w:p>
-    <w:p>
-      <w:pPr>
-        <w:ind w:left="850.3937007874017" w:firstLine="0"/>
-        <w:rPr/>
-      </w:pPr>
-      <w:r>
-        <w:rPr>
-          <w:rtl w:val="0"/>
-        </w:rPr>
-        <w:t xml:space="preserve">12: bolt</w:t>
-      </w:r>
-    </w:p>
-    <w:p>
-      <w:pPr>
-        <w:ind w:left="850.3937007874017" w:firstLine="0"/>
-        <w:rPr/>
-      </w:pPr>
-      <w:r>
-        <w:rPr>
-          <w:rtl w:val="0"/>
-        </w:rPr>
-        <w:t xml:space="preserve">13: raktár</w:t>
-      </w:r>
-    </w:p>
-    <w:p>
-      <w:pPr>
-        <w:ind w:left="850.3937007874017" w:firstLine="0"/>
-        <w:rPr/>
-      </w:pPr>
-      <w:r>
-        <w:rPr>
-          <w:rtl w:val="0"/>
-        </w:rPr>
-      </w:r>
-    </w:p>
-    <w:p>
-      <w:pPr>
-        <w:ind w:left="850.3937007874017" w:firstLine="0"/>
-        <w:rPr/>
-      </w:pPr>
-      <w:r>
-        <w:rPr>
-          <w:rtl w:val="0"/>
-        </w:rPr>
-        <w:t xml:space="preserve">A core switchre csatlakozik a Linux és a Windows szerver valamint a két, végpontokat kiszolgáló switch.</w:t>
-      </w:r>
-    </w:p>
-    <w:p>
-      <w:pPr>
-        <w:ind w:left="850.3937007874017" w:firstLine="0"/>
-        <w:rPr/>
-      </w:pPr>
-      <w:r>
-        <w:rPr>
-          <w:rtl w:val="0"/>
-        </w:rPr>
-      </w:r>
-    </w:p>
-    <w:p>
-      <w:pPr>
-        <w:ind w:left="850.3937007874017" w:firstLine="0"/>
-        <w:rPr/>
-      </w:pPr>
-      <w:r>
-        <w:rPr>
-          <w:rtl w:val="0"/>
-        </w:rPr>
-        <w:t xml:space="preserve">SW11, iroda </w:t>
-      </w:r>
-    </w:p>
-    <w:p>
-      <w:pPr>
-        <w:ind w:left="850.3937007874017" w:firstLine="0"/>
-        <w:rPr/>
-      </w:pPr>
-      <w:r>
-        <w:rPr>
-          <w:rtl w:val="0"/>
-        </w:rPr>
-        <w:t xml:space="preserve">G0/1 port uplink, VLAN10-13 trönkölve core switch felé, G0/2 tartalék  SW12 felé</w:t>
-      </w:r>
-    </w:p>
-    <w:p>
-      <w:pPr>
-        <w:ind w:left="850.3937007874017" w:firstLine="0"/>
-        <w:rPr/>
-      </w:pPr>
-      <w:r>
-        <w:rPr>
-          <w:rtl w:val="0"/>
-        </w:rPr>
-        <w:t xml:space="preserve">Fa0/1-Fa0/24 VLAN11 access, iroda hálózat</w:t>
-      </w:r>
-    </w:p>
-    <w:p>
-      <w:pPr>
-        <w:ind w:left="850.3937007874017" w:firstLine="0"/>
-        <w:rPr/>
-      </w:pPr>
-      <w:r>
-        <w:rPr>
-          <w:rtl w:val="0"/>
-        </w:rPr>
-      </w:r>
-    </w:p>
-    <w:p>
-      <w:pPr>
-        <w:ind w:left="850.3937007874017" w:firstLine="0"/>
-        <w:rPr/>
-      </w:pPr>
-      <w:r>
-        <w:rPr>
-          <w:rtl w:val="0"/>
-        </w:rPr>
-        <w:t xml:space="preserve">SW12 bolt, raktár:</w:t>
-      </w:r>
-    </w:p>
-    <w:p>
-      <w:pPr>
-        <w:ind w:left="850.3937007874017" w:firstLine="0"/>
-        <w:rPr/>
-      </w:pPr>
-      <w:r>
-        <w:rPr>
-          <w:rtl w:val="0"/>
-        </w:rPr>
-        <w:t xml:space="preserve">G0/1 port uplink, VLAN10-13 trönkölve core switch felé, G0/2 tartalék  SW11 felé</w:t>
-      </w:r>
-    </w:p>
-    <w:p>
-      <w:pPr>
-        <w:ind w:left="850.3937007874017" w:firstLine="0"/>
-        <w:rPr/>
-      </w:pPr>
-      <w:r>
-        <w:rPr>
-          <w:rtl w:val="0"/>
-        </w:rPr>
-        <w:t xml:space="preserve">Fa0/1-Fa0/12 VLAN12 access, bolt hálózat</w:t>
-      </w:r>
-    </w:p>
-    <w:p>
-      <w:pPr>
-        <w:ind w:left="850.3937007874017" w:firstLine="0"/>
-        <w:rPr/>
-      </w:pPr>
-      <w:r>
-        <w:rPr>
-          <w:rtl w:val="0"/>
-        </w:rPr>
-        <w:t xml:space="preserve">Fa0/13-Fa0/24 VLAN14 access, raktár hálózat</w:t>
-      </w:r>
-    </w:p>
-    <w:p>
-      <w:pPr>
-        <w:ind w:left="850.3937007874017" w:firstLine="0"/>
-        <w:rPr/>
-      </w:pPr>
-      <w:r>
-        <w:rPr>
-          <w:rtl w:val="0"/>
-        </w:rPr>
-      </w:r>
-    </w:p>
-    <w:p>
-      <w:pPr>
-        <w:ind w:left="850.3937007874017" w:firstLine="0"/>
-        <w:rPr/>
+          <w:sz w:val="28"/>
+          <w:szCs w:val="28"/>
+        </w:rPr>
       </w:pPr>
       <w:r>
         <w:rPr>
           <w:b w:val="1"/>
           <w:bCs w:val="1"/>
-          <w:rtl w:val="0"/>
-        </w:rPr>
-        <w:t xml:space="preserve">Vezeték nélküli hálózat: </w:t>
-      </w:r>
-      <w:r>
-        <w:rPr>
-          <w:rtl w:val="0"/>
-        </w:rPr>
-        <w:t xml:space="preserve">A raktárban telepítettünk egy WLAN AP-t a raktárkészlet követésére használt, vonalkódolvasóval ellátott  mobileszköz csatlakoztatásához.</w:t>
-      </w:r>
-    </w:p>
-    <w:p>
-      <w:pPr>
-        <w:ind w:left="850.3937007874017" w:firstLine="0"/>
-        <w:rPr/>
-      </w:pPr>
-      <w:r>
-        <w:rPr>
-          <w:rtl w:val="0"/>
-        </w:rPr>
-      </w:r>
-    </w:p>
-    <w:p>
-      <w:pPr>
-        <w:ind w:left="850.3937007874017" w:firstLine="0"/>
-        <w:rPr/>
-      </w:pPr>
-      <w:r>
-        <w:rPr>
-          <w:rtl w:val="0"/>
-        </w:rPr>
-        <w:t xml:space="preserve">A mohácsi és szigetvári telephelyeken csak bolt üzemel, azonos kialakításban. A telephelyi router bérelt vonalon csatlakozik a másik két telephelyhez, G0/0 portra csatlakozik a végpontokat kiszolgáló switch. Switchportok accessben.</w:t>
+          <w:sz w:val="28"/>
+          <w:szCs w:val="28"/>
+        </w:rPr>
+        <w:drawing>
+          <wp:inline distB="114300" distT="114300" distL="114300" distR="114300">
+            <wp:extent cx="5731200" cy="3454400"/>
+            <wp:effectExtent b="0" l="0" r="0" t="0"/>
+            <wp:docPr id="1" name="image1.png"/>
+            <a:graphic>
+              <a:graphicData uri="http://schemas.openxmlformats.org/drawingml/2006/picture">
+                <pic:pic>
+                  <pic:nvPicPr>
+                    <pic:cNvPr id="0" name="image1.png"/>
+                    <pic:cNvPicPr preferRelativeResize="0"/>
+                  </pic:nvPicPr>
+                  <pic:blipFill>
+                    <a:blip r:embed="rId7"/>
+                    <a:srcRect b="0" l="0" r="0" t="0"/>
+                    <a:stretch>
+                      <a:fillRect/>
+                    </a:stretch>
+                  </pic:blipFill>
+                  <pic:spPr>
+                    <a:xfrm>
+                      <a:off x="0" y="0"/>
+                      <a:ext cx="5731200" cy="3454400"/>
+                    </a:xfrm>
+                    <a:prstGeom prst="rect"/>
+                    <a:ln/>
+                  </pic:spPr>
+                </pic:pic>
+              </a:graphicData>
+            </a:graphic>
+          </wp:inline>
+        </w:drawing>
+      </w:r>
+      <w:r>
+        <w:rPr>
+          <w:rtl w:val="0"/>
+        </w:rPr>
+      </w:r>
+    </w:p>
+    <w:p>
+      <w:pPr>
+        <w:ind w:left="850.3937007874017" w:firstLine="0"/>
+        <w:rPr>
+          <w:sz w:val="28"/>
+          <w:szCs w:val="28"/>
+        </w:rPr>
+      </w:pPr>
+      <w:r>
+        <w:rPr>
+          <w:rtl w:val="0"/>
+        </w:rPr>
       </w:r>
     </w:p>
     <w:p>
@@ -573,107 +324,328 @@
           <w:bCs w:val="1"/>
           <w:rtl w:val="0"/>
         </w:rPr>
-        <w:t xml:space="preserve">WAN kapcsolat: </w:t>
-      </w:r>
-      <w:r>
-        <w:rPr>
-          <w:rtl w:val="0"/>
-        </w:rPr>
-        <w:t xml:space="preserve">A rendszer internetre csatlakozása a pécsi telephelyen valósul meg az ASA0 5505-ön keresztül.</w:t>
-      </w:r>
-    </w:p>
-    <w:p>
-      <w:pPr>
-        <w:ind w:left="850.3937007874017" w:firstLine="0"/>
-        <w:rPr/>
-      </w:pPr>
-      <w:r>
-        <w:rPr>
-          <w:rtl w:val="0"/>
-        </w:rPr>
-        <w:t xml:space="preserve">Kézzel konfigurált publikus IP-je van outside oldalon, egy kábelmodemen keresztül csatlakozik a szolgáltatói hálózathoz.</w:t>
-      </w:r>
-    </w:p>
-    <w:p>
-      <w:pPr>
-        <w:ind w:left="850.3937007874017" w:firstLine="0"/>
-        <w:rPr/>
-      </w:pPr>
-      <w:r>
-        <w:rPr>
-          <w:rtl w:val="0"/>
-        </w:rPr>
-      </w:r>
-    </w:p>
-    <w:p>
-      <w:pPr>
-        <w:ind w:left="850.3937007874017" w:firstLine="0"/>
-        <w:rPr/>
-      </w:pPr>
-      <w:r>
-        <w:rPr>
-          <w:rtl w:val="0"/>
-        </w:rPr>
-        <w:t xml:space="preserve"> A home office munkahelyen az ASA1 látja el a tűzfal és VPN szolgáltatást, szintén   kézzel konfigurált publikus IP-je van outside oldalon.</w:t>
-      </w:r>
-    </w:p>
-    <w:p>
-      <w:pPr>
-        <w:ind w:left="850.3937007874017" w:firstLine="0"/>
-        <w:rPr/>
-      </w:pPr>
-      <w:r>
-        <w:rPr>
-          <w:rtl w:val="0"/>
-        </w:rPr>
-      </w:r>
-    </w:p>
-    <w:p>
-      <w:pPr>
-        <w:ind w:left="850.3937007874017" w:firstLine="0"/>
-        <w:rPr/>
-      </w:pPr>
-      <w:r>
-        <w:rPr>
-          <w:rtl w:val="0"/>
-        </w:rPr>
-      </w:r>
-    </w:p>
-    <w:p>
-      <w:pPr>
-        <w:ind w:left="850.3937007874017" w:firstLine="0"/>
-        <w:rPr/>
-      </w:pPr>
-      <w:r>
-        <w:rPr>
-          <w:rtl w:val="0"/>
-        </w:rPr>
-      </w:r>
-    </w:p>
-    <w:p>
-      <w:pPr>
-        <w:ind w:left="850.3937007874017" w:firstLine="0"/>
+        <w:t xml:space="preserve">Pécs:</w:t>
+      </w:r>
+      <w:r>
+        <w:rPr>
+          <w:rtl w:val="0"/>
+        </w:rPr>
+        <w:t xml:space="preserve"> Központi telephely. </w:t>
+      </w:r>
+    </w:p>
+    <w:p>
+      <w:pPr>
+        <w:ind w:left="850.3937007874017" w:firstLine="0"/>
+        <w:rPr/>
+      </w:pPr>
+      <w:r>
+        <w:rPr>
+          <w:rtl w:val="0"/>
+        </w:rPr>
+        <w:t xml:space="preserve">R1 csatlakozik bérelt vonalakon a mohácsi R2-höz és a szigetvári R3-hoz. </w:t>
+      </w:r>
+    </w:p>
+    <w:p>
+      <w:pPr>
+        <w:ind w:left="850.3937007874017" w:firstLine="0"/>
+        <w:rPr/>
+      </w:pPr>
+      <w:r>
+        <w:rPr>
+          <w:rtl w:val="0"/>
+        </w:rPr>
+        <w:t xml:space="preserve">G0/0 porton az ASA0 biztosítja a publikus internet kapcsolatot egy kábelmodem segítségével. </w:t>
+      </w:r>
+    </w:p>
+    <w:p>
+      <w:pPr>
+        <w:ind w:left="850.3937007874017" w:firstLine="0"/>
+        <w:rPr/>
+      </w:pPr>
+      <w:r>
+        <w:rPr>
+          <w:rtl w:val="0"/>
+        </w:rPr>
+        <w:t xml:space="preserve">G0/1-en csatlakozik a core switch (SW10), trönk porton VLAN10..13 </w:t>
+      </w:r>
+    </w:p>
+    <w:p>
+      <w:pPr>
+        <w:ind w:left="850.3937007874017" w:firstLine="0"/>
+        <w:rPr/>
+      </w:pPr>
+      <w:r>
+        <w:rPr>
+          <w:rtl w:val="0"/>
+        </w:rPr>
+      </w:r>
+    </w:p>
+    <w:p>
+      <w:pPr>
+        <w:ind w:left="850.3937007874017" w:firstLine="0"/>
+        <w:rPr/>
+      </w:pPr>
+      <w:r>
         <w:rPr>
           <w:b w:val="1"/>
           <w:bCs w:val="1"/>
-        </w:rPr>
-      </w:pPr>
-      <w:r>
-        <w:br w:type="page"/>
-      </w:r>
-      <w:r>
-        <w:rPr>
-          <w:rtl w:val="0"/>
-        </w:rPr>
-      </w:r>
-    </w:p>
-    <w:p>
-      <w:pPr>
-        <w:ind w:left="850.3937007874017" w:firstLine="0"/>
+          <w:rtl w:val="0"/>
+        </w:rPr>
+        <w:t xml:space="preserve">VLANok</w:t>
+      </w:r>
+      <w:r>
+        <w:rPr>
+          <w:rtl w:val="0"/>
+        </w:rPr>
+        <w:t xml:space="preserve">:</w:t>
+      </w:r>
+    </w:p>
+    <w:p>
+      <w:pPr>
+        <w:ind w:left="850.3937007874017" w:firstLine="0"/>
+        <w:rPr/>
+      </w:pPr>
+      <w:r>
+        <w:rPr>
+          <w:rtl w:val="0"/>
+        </w:rPr>
+        <w:t xml:space="preserve">10: szerverek, switchek</w:t>
+      </w:r>
+    </w:p>
+    <w:p>
+      <w:pPr>
+        <w:ind w:left="850.3937007874017" w:firstLine="0"/>
+        <w:rPr/>
+      </w:pPr>
+      <w:r>
+        <w:rPr>
+          <w:rtl w:val="0"/>
+        </w:rPr>
+        <w:t xml:space="preserve">11: iroda</w:t>
+      </w:r>
+    </w:p>
+    <w:p>
+      <w:pPr>
+        <w:ind w:left="850.3937007874017" w:firstLine="0"/>
+        <w:rPr/>
+      </w:pPr>
+      <w:r>
+        <w:rPr>
+          <w:rtl w:val="0"/>
+        </w:rPr>
+        <w:t xml:space="preserve">12: bolt</w:t>
+      </w:r>
+    </w:p>
+    <w:p>
+      <w:pPr>
+        <w:ind w:left="850.3937007874017" w:firstLine="0"/>
+        <w:rPr/>
+      </w:pPr>
+      <w:r>
+        <w:rPr>
+          <w:rtl w:val="0"/>
+        </w:rPr>
+        <w:t xml:space="preserve">13: raktár</w:t>
+      </w:r>
+    </w:p>
+    <w:p>
+      <w:pPr>
+        <w:ind w:left="850.3937007874017" w:firstLine="0"/>
+        <w:rPr/>
+      </w:pPr>
+      <w:r>
+        <w:rPr>
+          <w:rtl w:val="0"/>
+        </w:rPr>
+      </w:r>
+    </w:p>
+    <w:p>
+      <w:pPr>
+        <w:ind w:left="850.3937007874017" w:firstLine="0"/>
+        <w:rPr/>
+      </w:pPr>
+      <w:r>
+        <w:rPr>
+          <w:rtl w:val="0"/>
+        </w:rPr>
+        <w:t xml:space="preserve">A core switchre csatlakozik a Linux és a Windows szerver valamint a két, végpontokat kiszolgáló switch.</w:t>
+      </w:r>
+    </w:p>
+    <w:p>
+      <w:pPr>
+        <w:ind w:left="850.3937007874017" w:firstLine="0"/>
+        <w:rPr/>
+      </w:pPr>
+      <w:r>
+        <w:rPr>
+          <w:rtl w:val="0"/>
+        </w:rPr>
+      </w:r>
+    </w:p>
+    <w:p>
+      <w:pPr>
+        <w:ind w:left="850.3937007874017" w:firstLine="0"/>
+        <w:rPr/>
+      </w:pPr>
+      <w:r>
+        <w:rPr>
+          <w:rtl w:val="0"/>
+        </w:rPr>
+        <w:t xml:space="preserve">SW11, iroda </w:t>
+      </w:r>
+    </w:p>
+    <w:p>
+      <w:pPr>
+        <w:ind w:left="850.3937007874017" w:firstLine="0"/>
+        <w:rPr/>
+      </w:pPr>
+      <w:r>
+        <w:rPr>
+          <w:rtl w:val="0"/>
+        </w:rPr>
+        <w:t xml:space="preserve">G0/1 port uplink, VLAN10-13 trönkölve core switch felé, G0/2 tartalék  SW12 felé</w:t>
+      </w:r>
+    </w:p>
+    <w:p>
+      <w:pPr>
+        <w:ind w:left="850.3937007874017" w:firstLine="0"/>
+        <w:rPr/>
+      </w:pPr>
+      <w:r>
+        <w:rPr>
+          <w:rtl w:val="0"/>
+        </w:rPr>
+        <w:t xml:space="preserve">Fa0/1-Fa0/24 VLAN11 access, iroda hálózat</w:t>
+      </w:r>
+    </w:p>
+    <w:p>
+      <w:pPr>
+        <w:ind w:left="850.3937007874017" w:firstLine="0"/>
+        <w:rPr/>
+      </w:pPr>
+      <w:r>
+        <w:rPr>
+          <w:rtl w:val="0"/>
+        </w:rPr>
+      </w:r>
+    </w:p>
+    <w:p>
+      <w:pPr>
+        <w:ind w:left="850.3937007874017" w:firstLine="0"/>
+        <w:rPr/>
+      </w:pPr>
+      <w:r>
+        <w:rPr>
+          <w:rtl w:val="0"/>
+        </w:rPr>
+        <w:t xml:space="preserve">SW12 bolt, raktár:</w:t>
+      </w:r>
+    </w:p>
+    <w:p>
+      <w:pPr>
+        <w:ind w:left="850.3937007874017" w:firstLine="0"/>
+        <w:rPr/>
+      </w:pPr>
+      <w:r>
+        <w:rPr>
+          <w:rtl w:val="0"/>
+        </w:rPr>
+        <w:t xml:space="preserve">G0/1 port uplink, VLAN10-13 trönkölve core switch felé, G0/2 tartalék  SW11 felé</w:t>
+      </w:r>
+    </w:p>
+    <w:p>
+      <w:pPr>
+        <w:ind w:left="850.3937007874017" w:firstLine="0"/>
+        <w:rPr/>
+      </w:pPr>
+      <w:r>
+        <w:rPr>
+          <w:rtl w:val="0"/>
+        </w:rPr>
+        <w:t xml:space="preserve">Fa0/1-Fa0/12 VLAN12 access, bolt hálózat</w:t>
+      </w:r>
+    </w:p>
+    <w:p>
+      <w:pPr>
+        <w:ind w:left="850.3937007874017" w:firstLine="0"/>
+        <w:rPr/>
+      </w:pPr>
+      <w:r>
+        <w:rPr>
+          <w:rtl w:val="0"/>
+        </w:rPr>
+        <w:t xml:space="preserve">Fa0/13-Fa0/24 VLAN14 access, raktár hálózat</w:t>
+      </w:r>
+    </w:p>
+    <w:p>
+      <w:pPr>
+        <w:ind w:left="850.3937007874017" w:firstLine="0"/>
+        <w:rPr/>
+      </w:pPr>
+      <w:r>
+        <w:rPr>
+          <w:rtl w:val="0"/>
+        </w:rPr>
+      </w:r>
+    </w:p>
+    <w:p>
+      <w:pPr>
+        <w:ind w:left="850.3937007874017" w:firstLine="0"/>
+        <w:rPr/>
+      </w:pPr>
+      <w:r>
         <w:rPr>
           <w:b w:val="1"/>
           <w:bCs w:val="1"/>
-        </w:rPr>
+          <w:rtl w:val="0"/>
+        </w:rPr>
+        <w:t xml:space="preserve">Vezeték nélküli hálózat: </w:t>
+      </w:r>
+      <w:r>
+        <w:rPr>
+          <w:rtl w:val="0"/>
+        </w:rPr>
+        <w:t xml:space="preserve">A raktárban telepítettünk egy WLAN AP-t a raktárkészlet követésére használt, vonalkódolvasóval ellátott  mobileszköz csatlakoztatásához.</w:t>
+      </w:r>
+    </w:p>
+    <w:p>
+      <w:pPr>
+        <w:ind w:left="850.3937007874017" w:firstLine="0"/>
+        <w:rPr/>
+      </w:pPr>
+      <w:r>
+        <w:rPr>
+          <w:rtl w:val="0"/>
+        </w:rPr>
+      </w:r>
+    </w:p>
+    <w:p>
+      <w:pPr>
+        <w:ind w:left="850.3937007874017" w:firstLine="0"/>
+        <w:rPr/>
+      </w:pPr>
+      <w:r>
+        <w:rPr>
+          <w:rtl w:val="0"/>
+        </w:rPr>
+        <w:t xml:space="preserve">A mohácsi és szigetvári telephelyeken csak bolt üzemel, azonos kialakításban. A telephelyi router bérelt vonalon csatlakozik a másik két telephelyhez, G0/0 portra csatlakozik a végpontokat kiszolgáló switch. Switchportok accessben.</w:t>
+      </w:r>
+    </w:p>
+    <w:p>
+      <w:pPr>
+        <w:ind w:left="850.3937007874017" w:firstLine="0"/>
+        <w:rPr/>
+      </w:pPr>
+      <w:r>
+        <w:rPr>
+          <w:rtl w:val="0"/>
+        </w:rPr>
+      </w:r>
+    </w:p>
+    <w:p>
+      <w:pPr>
+        <w:ind w:left="850.3937007874017" w:firstLine="0"/>
+        <w:rPr/>
       </w:pPr>
       <w:r>
         <w:rPr>
@@ -681,7 +653,81 @@
           <w:bCs w:val="1"/>
           <w:rtl w:val="0"/>
         </w:rPr>
-        <w:t xml:space="preserve">Statikus forgalomirányítás:</w:t>
+        <w:t xml:space="preserve">WAN kapcsolat: </w:t>
+      </w:r>
+      <w:r>
+        <w:rPr>
+          <w:rtl w:val="0"/>
+        </w:rPr>
+        <w:t xml:space="preserve">A rendszer internetre csatlakozása a pécsi telephelyen valósul meg az ASA0 5505-ön keresztül.</w:t>
+      </w:r>
+    </w:p>
+    <w:p>
+      <w:pPr>
+        <w:ind w:left="850.3937007874017" w:firstLine="0"/>
+        <w:rPr/>
+      </w:pPr>
+      <w:r>
+        <w:rPr>
+          <w:rtl w:val="0"/>
+        </w:rPr>
+        <w:t xml:space="preserve">Kézzel konfigurált publikus IP-je van outside oldalon, egy kábelmodemen keresztül csatlakozik a szolgáltatói hálózathoz.</w:t>
+      </w:r>
+    </w:p>
+    <w:p>
+      <w:pPr>
+        <w:ind w:left="850.3937007874017" w:firstLine="0"/>
+        <w:rPr/>
+      </w:pPr>
+      <w:r>
+        <w:rPr>
+          <w:rtl w:val="0"/>
+        </w:rPr>
+      </w:r>
+    </w:p>
+    <w:p>
+      <w:pPr>
+        <w:ind w:left="850.3937007874017" w:firstLine="0"/>
+        <w:rPr/>
+      </w:pPr>
+      <w:r>
+        <w:rPr>
+          <w:rtl w:val="0"/>
+        </w:rPr>
+        <w:t xml:space="preserve"> A home office munkahelyen az ASA1 látja el a tűzfal és VPN szolgáltatást, szintén   kézzel konfigurált publikus IP-je van outside oldalon.</w:t>
+      </w:r>
+    </w:p>
+    <w:p>
+      <w:pPr>
+        <w:ind w:left="850.3937007874017" w:firstLine="0"/>
+        <w:rPr/>
+      </w:pPr>
+      <w:r>
+        <w:rPr>
+          <w:rtl w:val="0"/>
+        </w:rPr>
+      </w:r>
+    </w:p>
+    <w:p>
+      <w:pPr>
+        <w:ind w:left="850.3937007874017" w:firstLine="0"/>
+        <w:rPr/>
+      </w:pPr>
+      <w:r>
+        <w:rPr>
+          <w:rtl w:val="0"/>
+        </w:rPr>
+      </w:r>
+    </w:p>
+    <w:p>
+      <w:pPr>
+        <w:ind w:left="850.3937007874017" w:firstLine="0"/>
+        <w:rPr/>
+      </w:pPr>
+      <w:r>
+        <w:rPr>
+          <w:rtl w:val="0"/>
+        </w:rPr>
       </w:r>
     </w:p>
     <w:p>
@@ -693,78 +739,112 @@
         </w:rPr>
       </w:pPr>
       <w:r>
-        <w:rPr>
-          <w:rtl w:val="0"/>
-        </w:rPr>
-      </w:r>
-    </w:p>
-    <w:p>
-      <w:pPr>
-        <w:ind w:left="850.3937007874017" w:firstLine="0"/>
-        <w:rPr/>
-      </w:pPr>
-      <w:r>
-        <w:rPr>
-          <w:rtl w:val="0"/>
-        </w:rPr>
-        <w:t xml:space="preserve">R1:</w:t>
-      </w:r>
-    </w:p>
-    <w:p>
-      <w:pPr>
-        <w:ind w:left="850.3937007874017" w:firstLine="0"/>
-        <w:rPr/>
-      </w:pPr>
-      <w:r>
-        <w:rPr>
-          <w:rtl w:val="0"/>
-        </w:rPr>
-      </w:r>
-    </w:p>
-    <w:p>
-      <w:pPr>
-        <w:ind w:left="850.3937007874017" w:firstLine="0"/>
-        <w:rPr/>
-      </w:pPr>
-      <w:r>
-        <w:rPr>
-          <w:rtl w:val="0"/>
-        </w:rPr>
-        <w:t xml:space="preserve">ip route 192.168.88.0 255.255.255.0 10.20.0.1 </w:t>
-      </w:r>
-    </w:p>
-    <w:p>
-      <w:pPr>
-        <w:ind w:left="850.3937007874017" w:firstLine="0"/>
-        <w:rPr/>
-      </w:pPr>
-      <w:r>
-        <w:rPr>
-          <w:rtl w:val="0"/>
-        </w:rPr>
-        <w:t xml:space="preserve">A VPN-en keresztül csatlakozó home office munkahely tartománya az ASA0 felé érhető el.</w:t>
-      </w:r>
-    </w:p>
-    <w:p>
-      <w:pPr>
-        <w:ind w:left="850.3937007874017" w:firstLine="0"/>
-        <w:rPr/>
-      </w:pPr>
-      <w:r>
-        <w:rPr>
-          <w:rtl w:val="0"/>
-        </w:rPr>
-      </w:r>
-    </w:p>
-    <w:p>
-      <w:pPr>
-        <w:ind w:left="850.3937007874017" w:firstLine="0"/>
-        <w:rPr/>
-      </w:pPr>
-      <w:r>
+        <w:br w:type="page"/>
+      </w:r>
+      <w:r>
+        <w:rPr>
+          <w:rtl w:val="0"/>
+        </w:rPr>
+      </w:r>
+    </w:p>
+    <w:p>
+      <w:pPr>
+        <w:ind w:left="850.3937007874017" w:firstLine="0"/>
         <w:rPr>
           <w:b w:val="1"/>
           <w:bCs w:val="1"/>
+        </w:rPr>
+      </w:pPr>
+      <w:r>
+        <w:rPr>
+          <w:b w:val="1"/>
+          <w:bCs w:val="1"/>
+          <w:rtl w:val="0"/>
+        </w:rPr>
+        <w:t xml:space="preserve">Statikus forgalomirányítás:</w:t>
+      </w:r>
+    </w:p>
+    <w:p>
+      <w:pPr>
+        <w:ind w:left="850.3937007874017" w:firstLine="0"/>
+        <w:rPr>
+          <w:b w:val="1"/>
+          <w:bCs w:val="1"/>
+        </w:rPr>
+      </w:pPr>
+      <w:r>
+        <w:rPr>
+          <w:rtl w:val="0"/>
+        </w:rPr>
+      </w:r>
+    </w:p>
+    <w:p>
+      <w:pPr>
+        <w:ind w:left="850.3937007874017" w:firstLine="0"/>
+        <w:rPr/>
+      </w:pPr>
+      <w:r>
+        <w:rPr>
+          <w:rtl w:val="0"/>
+        </w:rPr>
+        <w:t xml:space="preserve">R1:</w:t>
+      </w:r>
+    </w:p>
+    <w:p>
+      <w:pPr>
+        <w:ind w:left="850.3937007874017" w:firstLine="0"/>
+        <w:rPr/>
+      </w:pPr>
+      <w:r>
+        <w:rPr>
+          <w:rtl w:val="0"/>
+        </w:rPr>
+      </w:r>
+    </w:p>
+    <w:p>
+      <w:pPr>
+        <w:ind w:left="850.3937007874017" w:firstLine="0"/>
+        <w:rPr/>
+      </w:pPr>
+      <w:r>
+        <w:rPr>
+          <w:rtl w:val="0"/>
+        </w:rPr>
+        <w:t xml:space="preserve">ip route 192.168.88.0 255.255.255.0 10.20.0.1 </w:t>
+      </w:r>
+    </w:p>
+    <w:p>
+      <w:pPr>
+        <w:ind w:left="850.3937007874017" w:firstLine="0"/>
+        <w:rPr/>
+      </w:pPr>
+      <w:r>
+        <w:rPr>
+          <w:rtl w:val="0"/>
+        </w:rPr>
+        <w:t xml:space="preserve">A VPN-en keresztül csatlakozó home office munkahely tartománya az ASA0 felé érhető el.</w:t>
+      </w:r>
+    </w:p>
+    <w:p>
+      <w:pPr>
+        <w:ind w:left="850.3937007874017" w:firstLine="0"/>
+        <w:rPr/>
+      </w:pPr>
+      <w:r>
+        <w:rPr>
+          <w:rtl w:val="0"/>
+        </w:rPr>
+      </w:r>
+    </w:p>
+    <w:p>
+      <w:pPr>
+        <w:ind w:left="850.3937007874017" w:firstLine="0"/>
+        <w:rPr/>
+      </w:pPr>
+      <w:r>
+        <w:rPr>
+          <w:b w:val="1"/>
+          <w:bCs w:val="1"/>
           <w:rtl w:val="0"/>
         </w:rPr>
         <w:t xml:space="preserve">A második rétegbeli redundanciát</w:t>
@@ -773,7 +853,7 @@
         <w:rPr>
           <w:rtl w:val="0"/>
         </w:rPr>
-        <w:t xml:space="preserve"> az SW11-SW12 összekötése biztosítja, STP alapértelmezetten bontja ezt az útvonalat, az SW10 prioritása alacsonyabb, mint az SW11-12 eszközöké.</w:t>
+        <w:t xml:space="preserve"> a pécsi SW11-SW12 összekötése biztosítja, STP alapértelmezetten bontja ezt az útvonalat, a mindkét switch uplinkjét biztosító SW10 prioritása alacsonyabb, mint az SW11-12 eszközöké.</w:t>
       </w:r>
     </w:p>
     <w:p>
@@ -2372,16 +2452,20 @@
     </w:p>
     <w:p>
       <w:pPr>
-        <w:ind w:left="850.3937007874017" w:firstLine="0"/>
+        <w:ind w:left="0" w:firstLine="0"/>
         <w:rPr>
           <w:b w:val="1"/>
           <w:bCs w:val="1"/>
+          <w:sz w:val="28"/>
+          <w:szCs w:val="28"/>
         </w:rPr>
       </w:pPr>
       <w:r>
         <w:rPr>
           <w:b w:val="1"/>
           <w:bCs w:val="1"/>
+          <w:sz w:val="28"/>
+          <w:szCs w:val="28"/>
           <w:rtl w:val="0"/>
         </w:rPr>
         <w:t xml:space="preserve">Szerverek:</w:t>
@@ -2389,64 +2473,1526 @@
     </w:p>
     <w:p>
       <w:pPr>
-        <w:ind w:left="850.3937007874017" w:firstLine="0"/>
-        <w:rPr/>
-      </w:pPr>
-      <w:r>
-        <w:rPr>
-          <w:rtl w:val="0"/>
-        </w:rPr>
-      </w:r>
-    </w:p>
-    <w:p>
-      <w:pPr>
-        <w:ind w:left="850.3937007874017" w:firstLine="0"/>
-        <w:rPr/>
-      </w:pPr>
-      <w:r>
-        <w:rPr>
-          <w:rtl w:val="0"/>
-        </w:rPr>
-        <w:t xml:space="preserve">Linux szerver, 192.168.10.20</w:t>
-      </w:r>
-    </w:p>
-    <w:p>
-      <w:pPr>
-        <w:ind w:left="850.3937007874017" w:firstLine="0"/>
-        <w:rPr/>
-      </w:pPr>
-      <w:r>
-        <w:rPr>
-          <w:rtl w:val="0"/>
-        </w:rPr>
-      </w:r>
-    </w:p>
-    <w:p>
-      <w:pPr>
-        <w:ind w:left="850.3937007874017" w:firstLine="0"/>
-        <w:rPr/>
-      </w:pPr>
-      <w:r>
-        <w:rPr>
-          <w:rtl w:val="0"/>
-        </w:rPr>
-        <w:t xml:space="preserve">Windows szerver, 192.168.10.21</w:t>
-      </w:r>
-      <w:r>
-        <w:rPr>
-          <w:rtl w:val="0"/>
-        </w:rPr>
-      </w:r>
-    </w:p>
-    <w:p>
-      <w:pPr>
-        <w:ind w:left="850.3937007874017" w:firstLine="0"/>
-        <w:rPr/>
-      </w:pPr>
-      <w:r>
-        <w:rPr>
-          <w:rtl w:val="0"/>
-        </w:rPr>
+        <w:ind w:left="0" w:firstLine="0"/>
+        <w:rPr/>
+      </w:pPr>
+      <w:r>
+        <w:rPr>
+          <w:rtl w:val="0"/>
+        </w:rPr>
+      </w:r>
+    </w:p>
+    <w:p>
+      <w:pPr>
+        <w:spacing w:line="276" w:lineRule="auto"/>
+        <w:rPr/>
+      </w:pPr>
+      <w:r>
+        <w:rPr>
+          <w:b w:val="1"/>
+          <w:bCs w:val="1"/>
+          <w:rtl w:val="0"/>
+        </w:rPr>
+        <w:t xml:space="preserve">Linux szerver és szolgáltatásai: </w:t>
+      </w:r>
+      <w:r>
+        <w:rPr>
+          <w:rtl w:val="0"/>
+        </w:rPr>
+        <w:br w:type="textWrapping"/>
+      </w:r>
+    </w:p>
+    <w:p>
+      <w:pPr>
+        <w:spacing w:line="276" w:lineRule="auto"/>
+        <w:rPr/>
+      </w:pPr>
+      <w:r>
+        <w:rPr>
+          <w:rtl w:val="0"/>
+        </w:rPr>
+        <w:t xml:space="preserve">192.168.1.20</w:t>
+      </w:r>
+    </w:p>
+    <w:p>
+      <w:pPr>
+        <w:spacing w:line="276" w:lineRule="auto"/>
+        <w:rPr/>
+      </w:pPr>
+      <w:r>
+        <w:rPr>
+          <w:rtl w:val="0"/>
+        </w:rPr>
+      </w:r>
+    </w:p>
+    <w:p>
+      <w:pPr>
+        <w:spacing w:line="276" w:lineRule="auto"/>
+        <w:rPr/>
+      </w:pPr>
+      <w:r>
+        <w:rPr>
+          <w:rtl w:val="0"/>
+        </w:rPr>
+        <w:t xml:space="preserve">A rendszerben egy Linux alapú szerver került kialakításra, amely DHCPv6 és DNS szolgáltatásokat biztosít a hálózati kliensek számára. A szerver statikus IPv6 címmel került konfigurálásra.</w:t>
+      </w:r>
+    </w:p>
+    <w:p>
+      <w:pPr>
+        <w:spacing w:line="276" w:lineRule="auto"/>
+        <w:rPr/>
+      </w:pPr>
+      <w:r>
+        <w:rPr>
+          <w:rtl w:val="0"/>
+        </w:rPr>
+      </w:r>
+    </w:p>
+    <w:p>
+      <w:pPr>
+        <w:spacing w:line="276" w:lineRule="auto"/>
+        <w:rPr>
+          <w:b w:val="1"/>
+          <w:bCs w:val="1"/>
+        </w:rPr>
+      </w:pPr>
+      <w:r>
+        <w:rPr>
+          <w:b w:val="1"/>
+          <w:bCs w:val="1"/>
+          <w:rtl w:val="0"/>
+        </w:rPr>
+        <w:t xml:space="preserve">DHCPv6 szerver</w:t>
+      </w:r>
+    </w:p>
+    <w:p>
+      <w:pPr>
+        <w:spacing w:line="276" w:lineRule="auto"/>
+        <w:rPr/>
+      </w:pPr>
+      <w:r>
+        <w:rPr>
+          <w:rtl w:val="0"/>
+        </w:rPr>
+        <w:t xml:space="preserve">A DHCPv6 szolgáltatás telepítése az alábbi paranccsal történt:</w:t>
+      </w:r>
+    </w:p>
+    <w:p>
+      <w:pPr>
+        <w:spacing w:line="276" w:lineRule="auto"/>
+        <w:rPr/>
+      </w:pPr>
+      <w:r>
+        <w:rPr>
+          <w:rtl w:val="0"/>
+        </w:rPr>
+      </w:r>
+    </w:p>
+    <w:p>
+      <w:pPr>
+        <w:spacing w:line="276" w:lineRule="auto"/>
+        <w:rPr/>
+      </w:pPr>
+      <w:r>
+        <w:rPr>
+          <w:rtl w:val="0"/>
+        </w:rPr>
+        <w:t xml:space="preserve">sudo apt update</w:t>
+      </w:r>
+    </w:p>
+    <w:p>
+      <w:pPr>
+        <w:spacing w:line="276" w:lineRule="auto"/>
+        <w:rPr/>
+      </w:pPr>
+      <w:r>
+        <w:rPr>
+          <w:rtl w:val="0"/>
+        </w:rPr>
+        <w:t xml:space="preserve">sudo apt install isc-dhcp-server</w:t>
+      </w:r>
+    </w:p>
+    <w:p>
+      <w:pPr>
+        <w:spacing w:line="276" w:lineRule="auto"/>
+        <w:rPr/>
+      </w:pPr>
+      <w:r>
+        <w:rPr>
+          <w:rtl w:val="0"/>
+        </w:rPr>
+      </w:r>
+    </w:p>
+    <w:p>
+      <w:pPr>
+        <w:spacing w:line="276" w:lineRule="auto"/>
+        <w:rPr/>
+      </w:pPr>
+      <w:r>
+        <w:rPr>
+          <w:rtl w:val="0"/>
+        </w:rPr>
+        <w:t xml:space="preserve">A DHCPv6 konfiguráció az `/etc/dhcp/dhcpd6.conf` fájlban került beállításra. Például:</w:t>
+      </w:r>
+    </w:p>
+    <w:p>
+      <w:pPr>
+        <w:spacing w:line="276" w:lineRule="auto"/>
+        <w:rPr/>
+      </w:pPr>
+      <w:r>
+        <w:rPr>
+          <w:rtl w:val="0"/>
+        </w:rPr>
+      </w:r>
+    </w:p>
+    <w:p>
+      <w:pPr>
+        <w:spacing w:line="276" w:lineRule="auto"/>
+        <w:rPr/>
+      </w:pPr>
+      <w:r>
+        <w:rPr>
+          <w:rtl w:val="0"/>
+        </w:rPr>
+        <w:t xml:space="preserve">default-lease-time 600;</w:t>
+      </w:r>
+    </w:p>
+    <w:p>
+      <w:pPr>
+        <w:spacing w:line="276" w:lineRule="auto"/>
+        <w:rPr/>
+      </w:pPr>
+      <w:r>
+        <w:rPr>
+          <w:rtl w:val="0"/>
+        </w:rPr>
+        <w:t xml:space="preserve">max-lease-time 7200;</w:t>
+      </w:r>
+    </w:p>
+    <w:p>
+      <w:pPr>
+        <w:spacing w:line="276" w:lineRule="auto"/>
+        <w:rPr/>
+      </w:pPr>
+      <w:r>
+        <w:rPr>
+          <w:rtl w:val="0"/>
+        </w:rPr>
+        <w:t xml:space="preserve">subnet6 2001:db8:100::/64 {</w:t>
+      </w:r>
+    </w:p>
+    <w:p>
+      <w:pPr>
+        <w:spacing w:line="276" w:lineRule="auto"/>
+        <w:rPr/>
+      </w:pPr>
+      <w:r>
+        <w:rPr>
+          <w:rtl w:val="0"/>
+        </w:rPr>
+        <w:t xml:space="preserve">    range6 2001:db8:100::100 2001:db8:100::200;</w:t>
+      </w:r>
+    </w:p>
+    <w:p>
+      <w:pPr>
+        <w:spacing w:line="276" w:lineRule="auto"/>
+        <w:rPr/>
+      </w:pPr>
+      <w:r>
+        <w:rPr>
+          <w:rtl w:val="0"/>
+        </w:rPr>
+        <w:t xml:space="preserve">}</w:t>
+      </w:r>
+    </w:p>
+    <w:p>
+      <w:pPr>
+        <w:spacing w:line="276" w:lineRule="auto"/>
+        <w:rPr/>
+      </w:pPr>
+      <w:r>
+        <w:rPr>
+          <w:rtl w:val="0"/>
+        </w:rPr>
+      </w:r>
+    </w:p>
+    <w:p>
+      <w:pPr>
+        <w:spacing w:line="276" w:lineRule="auto"/>
+        <w:rPr/>
+      </w:pPr>
+      <w:r>
+        <w:rPr>
+          <w:rtl w:val="0"/>
+        </w:rPr>
+        <w:t xml:space="preserve">A szolgáltatás az IPv6 hálózaton megadott tartományból oszt címeket a kliensek számára.</w:t>
+      </w:r>
+    </w:p>
+    <w:p>
+      <w:pPr>
+        <w:spacing w:line="276" w:lineRule="auto"/>
+        <w:rPr/>
+      </w:pPr>
+      <w:r>
+        <w:rPr>
+          <w:rtl w:val="0"/>
+        </w:rPr>
+        <w:t xml:space="preserve">A konfiguráció ellenőrzése:</w:t>
+      </w:r>
+    </w:p>
+    <w:p>
+      <w:pPr>
+        <w:spacing w:line="276" w:lineRule="auto"/>
+        <w:rPr/>
+      </w:pPr>
+      <w:r>
+        <w:rPr>
+          <w:rtl w:val="0"/>
+        </w:rPr>
+      </w:r>
+    </w:p>
+    <w:p>
+      <w:pPr>
+        <w:spacing w:line="276" w:lineRule="auto"/>
+        <w:rPr/>
+      </w:pPr>
+      <w:r>
+        <w:rPr>
+          <w:rtl w:val="0"/>
+        </w:rPr>
+        <w:t xml:space="preserve">sudo dhcpd -t -6 -cf /etc/dhcp/dhcpd6.conf</w:t>
+      </w:r>
+    </w:p>
+    <w:p>
+      <w:pPr>
+        <w:spacing w:line="276" w:lineRule="auto"/>
+        <w:rPr/>
+      </w:pPr>
+      <w:r>
+        <w:rPr>
+          <w:rtl w:val="0"/>
+        </w:rPr>
+      </w:r>
+    </w:p>
+    <w:p>
+      <w:pPr>
+        <w:spacing w:line="276" w:lineRule="auto"/>
+        <w:rPr/>
+      </w:pPr>
+      <w:r>
+        <w:rPr>
+          <w:rtl w:val="0"/>
+        </w:rPr>
+        <w:t xml:space="preserve">A szolgáltatás engedélyezése és indítása:</w:t>
+      </w:r>
+    </w:p>
+    <w:p>
+      <w:pPr>
+        <w:spacing w:line="276" w:lineRule="auto"/>
+        <w:rPr/>
+      </w:pPr>
+      <w:r>
+        <w:rPr>
+          <w:rtl w:val="0"/>
+        </w:rPr>
+      </w:r>
+    </w:p>
+    <w:p>
+      <w:pPr>
+        <w:spacing w:line="276" w:lineRule="auto"/>
+        <w:rPr/>
+      </w:pPr>
+      <w:r>
+        <w:rPr>
+          <w:rtl w:val="0"/>
+        </w:rPr>
+        <w:t xml:space="preserve">sudo systemctl enable isc-dhcp-server</w:t>
+      </w:r>
+    </w:p>
+    <w:p>
+      <w:pPr>
+        <w:spacing w:line="276" w:lineRule="auto"/>
+        <w:rPr/>
+      </w:pPr>
+      <w:r>
+        <w:rPr>
+          <w:rtl w:val="0"/>
+        </w:rPr>
+        <w:t xml:space="preserve">sudo systemctl restart isc-dhcp-server</w:t>
+      </w:r>
+    </w:p>
+    <w:p>
+      <w:pPr>
+        <w:spacing w:line="276" w:lineRule="auto"/>
+        <w:rPr/>
+      </w:pPr>
+      <w:r>
+        <w:rPr>
+          <w:rtl w:val="0"/>
+        </w:rPr>
+        <w:t xml:space="preserve">sudo systemctl status isc-dhcp-server</w:t>
+      </w:r>
+    </w:p>
+    <w:p>
+      <w:pPr>
+        <w:spacing w:line="276" w:lineRule="auto"/>
+        <w:rPr/>
+      </w:pPr>
+      <w:r>
+        <w:rPr>
+          <w:rtl w:val="0"/>
+        </w:rPr>
+      </w:r>
+    </w:p>
+    <w:p>
+      <w:pPr>
+        <w:spacing w:line="276" w:lineRule="auto"/>
+        <w:rPr>
+          <w:b w:val="1"/>
+          <w:bCs w:val="1"/>
+        </w:rPr>
+      </w:pPr>
+      <w:r>
+        <w:rPr>
+          <w:b w:val="1"/>
+          <w:bCs w:val="1"/>
+          <w:rtl w:val="0"/>
+        </w:rPr>
+        <w:t xml:space="preserve">DNS szerver</w:t>
+      </w:r>
+    </w:p>
+    <w:p>
+      <w:pPr>
+        <w:spacing w:line="276" w:lineRule="auto"/>
+        <w:rPr/>
+      </w:pPr>
+      <w:r>
+        <w:rPr>
+          <w:rtl w:val="0"/>
+        </w:rPr>
+        <w:t xml:space="preserve">A névfeloldás biztosítására BIND9 DNS szerver került telepítésre:</w:t>
+      </w:r>
+    </w:p>
+    <w:p>
+      <w:pPr>
+        <w:spacing w:line="276" w:lineRule="auto"/>
+        <w:rPr/>
+      </w:pPr>
+      <w:r>
+        <w:rPr>
+          <w:rtl w:val="0"/>
+        </w:rPr>
+      </w:r>
+    </w:p>
+    <w:p>
+      <w:pPr>
+        <w:spacing w:line="276" w:lineRule="auto"/>
+        <w:rPr/>
+      </w:pPr>
+      <w:r>
+        <w:rPr>
+          <w:rtl w:val="0"/>
+        </w:rPr>
+        <w:t xml:space="preserve">sudo apt install bind9 bind9-utils</w:t>
+      </w:r>
+    </w:p>
+    <w:p>
+      <w:pPr>
+        <w:spacing w:line="276" w:lineRule="auto"/>
+        <w:rPr/>
+      </w:pPr>
+      <w:r>
+        <w:rPr>
+          <w:rtl w:val="0"/>
+        </w:rPr>
+      </w:r>
+    </w:p>
+    <w:p>
+      <w:pPr>
+        <w:spacing w:line="276" w:lineRule="auto"/>
+        <w:rPr/>
+      </w:pPr>
+      <w:r>
+        <w:rPr>
+          <w:rtl w:val="0"/>
+        </w:rPr>
+        <w:t xml:space="preserve">A DNS zóna konfigurációja a `/etc/bind/` könyvtárban került kialakításra. A zónában a hálózaton használt eszközök neveihez IPv4 és IPv6 címek kerültek hozzárendelésre.</w:t>
+      </w:r>
+    </w:p>
+    <w:p>
+      <w:pPr>
+        <w:spacing w:line="276" w:lineRule="auto"/>
+        <w:rPr/>
+      </w:pPr>
+      <w:r>
+        <w:rPr>
+          <w:rtl w:val="0"/>
+        </w:rPr>
+        <w:t xml:space="preserve">A konfiguráció ellenőrzése:</w:t>
+      </w:r>
+    </w:p>
+    <w:p>
+      <w:pPr>
+        <w:spacing w:line="276" w:lineRule="auto"/>
+        <w:rPr/>
+      </w:pPr>
+      <w:r>
+        <w:rPr>
+          <w:rtl w:val="0"/>
+        </w:rPr>
+      </w:r>
+    </w:p>
+    <w:p>
+      <w:pPr>
+        <w:spacing w:line="276" w:lineRule="auto"/>
+        <w:rPr/>
+      </w:pPr>
+      <w:r>
+        <w:rPr>
+          <w:rtl w:val="0"/>
+        </w:rPr>
+        <w:t xml:space="preserve">sudo named-checkconf</w:t>
+      </w:r>
+    </w:p>
+    <w:p>
+      <w:pPr>
+        <w:spacing w:line="276" w:lineRule="auto"/>
+        <w:rPr/>
+      </w:pPr>
+      <w:r>
+        <w:rPr>
+          <w:rtl w:val="0"/>
+        </w:rPr>
+        <w:t xml:space="preserve">sudo named-checkzone sajatdomain.hu /etc/bind/db.sajatdomain.hu</w:t>
+      </w:r>
+    </w:p>
+    <w:p>
+      <w:pPr>
+        <w:spacing w:line="276" w:lineRule="auto"/>
+        <w:rPr/>
+      </w:pPr>
+      <w:r>
+        <w:rPr>
+          <w:rtl w:val="0"/>
+        </w:rPr>
+      </w:r>
+    </w:p>
+    <w:p>
+      <w:pPr>
+        <w:spacing w:line="276" w:lineRule="auto"/>
+        <w:rPr/>
+      </w:pPr>
+      <w:r>
+        <w:rPr>
+          <w:rtl w:val="0"/>
+        </w:rPr>
+        <w:t xml:space="preserve">A BIND9 szolgáltatás indítása és ellenőrzése:</w:t>
+      </w:r>
+    </w:p>
+    <w:p>
+      <w:pPr>
+        <w:spacing w:line="276" w:lineRule="auto"/>
+        <w:rPr/>
+      </w:pPr>
+      <w:r>
+        <w:rPr>
+          <w:rtl w:val="0"/>
+        </w:rPr>
+      </w:r>
+    </w:p>
+    <w:p>
+      <w:pPr>
+        <w:spacing w:line="276" w:lineRule="auto"/>
+        <w:rPr/>
+      </w:pPr>
+      <w:r>
+        <w:rPr>
+          <w:rtl w:val="0"/>
+        </w:rPr>
+        <w:t xml:space="preserve">sudo systemctl enable bind9</w:t>
+      </w:r>
+    </w:p>
+    <w:p>
+      <w:pPr>
+        <w:spacing w:line="276" w:lineRule="auto"/>
+        <w:rPr/>
+      </w:pPr>
+      <w:r>
+        <w:rPr>
+          <w:rtl w:val="0"/>
+        </w:rPr>
+        <w:t xml:space="preserve">sudo systemctl restart bind9</w:t>
+      </w:r>
+    </w:p>
+    <w:p>
+      <w:pPr>
+        <w:spacing w:line="276" w:lineRule="auto"/>
+        <w:rPr/>
+      </w:pPr>
+      <w:r>
+        <w:rPr>
+          <w:rtl w:val="0"/>
+        </w:rPr>
+        <w:t xml:space="preserve">sudo systemctl status bind9</w:t>
+      </w:r>
+    </w:p>
+    <w:p>
+      <w:pPr>
+        <w:spacing w:line="276" w:lineRule="auto"/>
+        <w:rPr/>
+      </w:pPr>
+      <w:r>
+        <w:rPr>
+          <w:rtl w:val="0"/>
+        </w:rPr>
+      </w:r>
+    </w:p>
+    <w:p>
+      <w:pPr>
+        <w:spacing w:line="276" w:lineRule="auto"/>
+        <w:rPr/>
+      </w:pPr>
+      <w:r>
+        <w:rPr>
+          <w:rtl w:val="0"/>
+        </w:rPr>
+        <w:t xml:space="preserve">A DNS működése a `dig` paranccsal ellenőrizhető:</w:t>
+      </w:r>
+    </w:p>
+    <w:p>
+      <w:pPr>
+        <w:spacing w:line="276" w:lineRule="auto"/>
+        <w:rPr/>
+      </w:pPr>
+      <w:r>
+        <w:rPr>
+          <w:rtl w:val="0"/>
+        </w:rPr>
+      </w:r>
+    </w:p>
+    <w:p>
+      <w:pPr>
+        <w:spacing w:line="276" w:lineRule="auto"/>
+        <w:rPr/>
+      </w:pPr>
+      <w:r>
+        <w:rPr>
+          <w:rtl w:val="0"/>
+        </w:rPr>
+        <w:t xml:space="preserve">dig @localhost server.sajatdomain.hu</w:t>
+      </w:r>
+    </w:p>
+    <w:p>
+      <w:pPr>
+        <w:spacing w:line="276" w:lineRule="auto"/>
+        <w:rPr/>
+      </w:pPr>
+      <w:r>
+        <w:rPr>
+          <w:rtl w:val="0"/>
+        </w:rPr>
+      </w:r>
+    </w:p>
+    <w:p>
+      <w:pPr>
+        <w:spacing w:line="276" w:lineRule="auto"/>
+        <w:rPr/>
+      </w:pPr>
+      <w:r>
+        <w:rPr>
+          <w:rtl w:val="0"/>
+        </w:rPr>
+        <w:t xml:space="preserve">A teszt során a DNS szerver a beállított névhez tartozó IP-címet megfelelően visszaadta, így a névfeloldás és a DHCPv6 szolgáltatás működése is ellenőrzésre került.</w:t>
+      </w:r>
+    </w:p>
+    <w:p>
+      <w:pPr>
+        <w:rPr/>
+      </w:pPr>
+      <w:r>
+        <w:rPr>
+          <w:rtl w:val="0"/>
+        </w:rPr>
+      </w:r>
+    </w:p>
+    <w:p>
+      <w:pPr>
+        <w:ind w:left="0" w:firstLine="0"/>
+        <w:rPr/>
+      </w:pPr>
+      <w:r>
+        <w:rPr>
+          <w:rtl w:val="0"/>
+        </w:rPr>
+      </w:r>
+    </w:p>
+    <w:p>
+      <w:pPr>
+        <w:ind w:left="850.3937007874017" w:firstLine="0"/>
+        <w:rPr/>
+      </w:pPr>
+      <w:r>
+        <w:rPr>
+          <w:rtl w:val="0"/>
+        </w:rPr>
+      </w:r>
+    </w:p>
+    <w:p>
+      <w:pPr>
+        <w:ind w:left="0" w:firstLine="0"/>
+        <w:rPr>
+          <w:b w:val="1"/>
+          <w:bCs w:val="1"/>
+        </w:rPr>
+      </w:pPr>
+      <w:r>
+        <w:rPr>
+          <w:b w:val="1"/>
+          <w:bCs w:val="1"/>
+          <w:rtl w:val="0"/>
+        </w:rPr>
+        <w:t xml:space="preserve">Windows szerver és szolgáltatásai:</w:t>
+      </w:r>
+    </w:p>
+    <w:p>
+      <w:pPr>
+        <w:ind w:left="850.3937007874017" w:firstLine="0"/>
+        <w:rPr/>
+      </w:pPr>
+      <w:r>
+        <w:rPr>
+          <w:rtl w:val="0"/>
+        </w:rPr>
+      </w:r>
+    </w:p>
+    <w:p>
+      <w:pPr>
+        <w:ind w:left="0" w:firstLine="0"/>
+        <w:rPr/>
+      </w:pPr>
+      <w:r>
+        <w:rPr>
+          <w:rtl w:val="0"/>
+        </w:rPr>
+        <w:t xml:space="preserve">192.168.10.21</w:t>
+      </w:r>
+    </w:p>
+    <w:p>
+      <w:pPr>
+        <w:ind w:left="0" w:firstLine="0"/>
+        <w:rPr/>
+      </w:pPr>
+      <w:r>
+        <w:rPr>
+          <w:rtl w:val="0"/>
+        </w:rPr>
+      </w:r>
+    </w:p>
+    <w:p>
+      <w:pPr>
+        <w:spacing w:after="120" w:line="276" w:lineRule="auto"/>
+        <w:rPr/>
+      </w:pPr>
+      <w:r>
+        <w:rPr>
+          <w:rtl w:val="0"/>
+        </w:rPr>
+        <w:t xml:space="preserve">A következő szerverszolgáltatásokhoz a 2019-es Windows szervert</w:t>
+        <w:br w:type="textWrapping"/>
+        <w:t xml:space="preserve"> használtuk:</w:t>
+      </w:r>
+    </w:p>
+    <w:p>
+      <w:pPr>
+        <w:numPr>
+          <w:ilvl w:val="0"/>
+          <w:numId w:val="1"/>
+        </w:numPr>
+        <w:spacing w:after="0" w:afterAutospacing="0" w:before="240" w:line="276" w:lineRule="auto"/>
+        <w:ind w:left="720" w:hanging="360"/>
+        <w:rPr/>
+      </w:pPr>
+      <w:r>
+        <w:rPr>
+          <w:i w:val="1"/>
+          <w:iCs w:val="1"/>
+          <w:rtl w:val="0"/>
+        </w:rPr>
+        <w:t xml:space="preserve">Active Directory DS</w:t>
+      </w:r>
+    </w:p>
+    <w:p>
+      <w:pPr>
+        <w:numPr>
+          <w:ilvl w:val="0"/>
+          <w:numId w:val="1"/>
+        </w:numPr>
+        <w:spacing w:after="360" w:before="0" w:beforeAutospacing="0" w:line="276" w:lineRule="auto"/>
+        <w:ind w:left="720" w:hanging="360"/>
+        <w:rPr/>
+      </w:pPr>
+      <w:r>
+        <w:rPr>
+          <w:i w:val="1"/>
+          <w:iCs w:val="1"/>
+          <w:rtl w:val="0"/>
+        </w:rPr>
+        <w:t xml:space="preserve">Automatizált szoftvertelepítés</w:t>
+      </w:r>
+    </w:p>
+    <w:p>
+      <w:pPr>
+        <w:spacing w:after="120" w:line="276" w:lineRule="auto"/>
+        <w:jc w:val="both"/>
+        <w:rPr>
+          <w:i w:val="1"/>
+          <w:iCs w:val="1"/>
+          <w:u w:val="single"/>
+        </w:rPr>
+      </w:pPr>
+      <w:r>
+        <w:rPr>
+          <w:i w:val="1"/>
+          <w:iCs w:val="1"/>
+          <w:u w:val="single"/>
+          <w:rtl w:val="0"/>
+        </w:rPr>
+        <w:t xml:space="preserve">Windows szerver IP címe: 192.168.10.21</w:t>
+      </w:r>
+    </w:p>
+    <w:p>
+      <w:pPr>
+        <w:spacing w:after="120" w:line="276" w:lineRule="auto"/>
+        <w:jc w:val="both"/>
+        <w:rPr/>
+      </w:pPr>
+      <w:r>
+        <w:rPr>
+          <w:rtl w:val="0"/>
+        </w:rPr>
+        <w:t xml:space="preserve">A virtuális gép beállításait az operációs rendszert, valamint a futtatandó szolgáltatásokat is figyelembe véve állítottuk be. Ezek a következők lettek: </w:t>
+      </w:r>
+    </w:p>
+    <w:p>
+      <w:pPr>
+        <w:numPr>
+          <w:ilvl w:val="0"/>
+          <w:numId w:val="2"/>
+        </w:numPr>
+        <w:spacing w:after="0" w:afterAutospacing="0" w:before="240" w:line="276" w:lineRule="auto"/>
+        <w:ind w:left="720" w:hanging="360"/>
+        <w:jc w:val="both"/>
+        <w:rPr/>
+      </w:pPr>
+      <w:r>
+        <w:rPr>
+          <w:rtl w:val="0"/>
+        </w:rPr>
+        <w:t xml:space="preserve">Rendszermemória 2048 MB</w:t>
+      </w:r>
+    </w:p>
+    <w:p>
+      <w:pPr>
+        <w:numPr>
+          <w:ilvl w:val="0"/>
+          <w:numId w:val="2"/>
+        </w:numPr>
+        <w:spacing w:after="0" w:afterAutospacing="0" w:before="0" w:beforeAutospacing="0" w:line="276" w:lineRule="auto"/>
+        <w:ind w:left="720" w:hanging="360"/>
+        <w:jc w:val="both"/>
+        <w:rPr/>
+      </w:pPr>
+      <w:r>
+        <w:rPr>
+          <w:rtl w:val="0"/>
+        </w:rPr>
+        <w:t xml:space="preserve">Tárhely mérete: 50 GB</w:t>
+      </w:r>
+    </w:p>
+    <w:p>
+      <w:pPr>
+        <w:numPr>
+          <w:ilvl w:val="0"/>
+          <w:numId w:val="2"/>
+        </w:numPr>
+        <w:spacing w:after="0" w:afterAutospacing="0" w:before="0" w:beforeAutospacing="0" w:line="276" w:lineRule="auto"/>
+        <w:ind w:left="720" w:hanging="360"/>
+        <w:jc w:val="both"/>
+        <w:rPr/>
+      </w:pPr>
+      <w:r>
+        <w:rPr>
+          <w:rtl w:val="0"/>
+        </w:rPr>
+        <w:t xml:space="preserve">Tárhely típusa: Dinamikus</w:t>
+      </w:r>
+    </w:p>
+    <w:p>
+      <w:pPr>
+        <w:numPr>
+          <w:ilvl w:val="0"/>
+          <w:numId w:val="2"/>
+        </w:numPr>
+        <w:spacing w:after="360" w:before="0" w:beforeAutospacing="0" w:line="276" w:lineRule="auto"/>
+        <w:ind w:left="720" w:hanging="360"/>
+        <w:jc w:val="both"/>
+        <w:rPr/>
+      </w:pPr>
+      <w:r>
+        <w:rPr>
+          <w:rtl w:val="0"/>
+        </w:rPr>
+        <w:t xml:space="preserve">Hálózati kártya: Egy darab Bridge módban</w:t>
+      </w:r>
+    </w:p>
+    <w:p>
+      <w:pPr>
+        <w:spacing w:after="120" w:line="276" w:lineRule="auto"/>
+        <w:jc w:val="both"/>
+        <w:rPr/>
+      </w:pPr>
+      <w:r>
+        <w:rPr>
+          <w:rtl w:val="0"/>
+        </w:rPr>
+        <w:t xml:space="preserve">A Server Managerben töltöttük le a szolgáltatásokat.  </w:t>
+      </w:r>
+    </w:p>
+    <w:p>
+      <w:pPr>
+        <w:spacing w:after="120" w:line="276" w:lineRule="auto"/>
+        <w:jc w:val="both"/>
+        <w:rPr>
+          <w:i w:val="1"/>
+          <w:iCs w:val="1"/>
+          <w:u w:val="single"/>
+        </w:rPr>
+      </w:pPr>
+      <w:r>
+        <w:rPr>
+          <w:i w:val="1"/>
+          <w:iCs w:val="1"/>
+          <w:u w:val="single"/>
+          <w:rtl w:val="0"/>
+        </w:rPr>
+        <w:t xml:space="preserve">Active Directory </w:t>
+      </w:r>
+    </w:p>
+    <w:p>
+      <w:pPr>
+        <w:spacing w:after="120" w:line="276" w:lineRule="auto"/>
+        <w:jc w:val="both"/>
+        <w:rPr/>
+      </w:pPr>
+      <w:r>
+        <w:rPr>
+          <w:rtl w:val="0"/>
+        </w:rPr>
+        <w:t xml:space="preserve">Miután elvégeztük az alapvető beállításokat, telepítettük az Active Directory Domain Services szolgáltatást telepítettük. E szolgáltatás azonosítani és korlátozni tudja a felhasználókat, így az illetéktelen eléréseket is meg tudja gátolni.  </w:t>
+      </w:r>
+    </w:p>
+    <w:p>
+      <w:pPr>
+        <w:spacing w:after="120" w:line="276" w:lineRule="auto"/>
+        <w:rPr>
+          <w:color w:val="6c6c6c"/>
+        </w:rPr>
+      </w:pPr>
+      <w:r>
+        <w:rPr>
+          <w:rtl w:val="0"/>
+        </w:rPr>
+        <w:t xml:space="preserve">A szolgáltatás telepítése után promotáltuk a szervert:</w:t>
+        <w:br w:type="textWrapping"/>
+        <w:t xml:space="preserve"> </w:t>
+      </w:r>
+      <w:r>
+        <w:rPr>
+          <w:color w:val="6c6c6c"/>
+          <w:rtl w:val="0"/>
+        </w:rPr>
+        <w:t xml:space="preserve"> - Promote this server to a domain controller</w:t>
+      </w:r>
+    </w:p>
+    <w:p>
+      <w:pPr>
+        <w:spacing w:after="120" w:line="276" w:lineRule="auto"/>
+        <w:rPr/>
+      </w:pPr>
+      <w:r>
+        <w:rPr>
+          <w:rtl w:val="0"/>
+        </w:rPr>
+        <w:t xml:space="preserve">Majd Add a </w:t>
+      </w:r>
+      <w:r>
+        <w:rPr>
+          <w:color w:val="6c6c6c"/>
+          <w:rtl w:val="0"/>
+        </w:rPr>
+        <w:t xml:space="preserve">new forest-al </w:t>
+      </w:r>
+      <w:r>
+        <w:rPr>
+          <w:rtl w:val="0"/>
+        </w:rPr>
+        <w:t xml:space="preserve">létrehoztuk a </w:t>
+      </w:r>
+      <w:r>
+        <w:rPr>
+          <w:color w:val="6c6c6c"/>
+          <w:rtl w:val="0"/>
+        </w:rPr>
+        <w:t xml:space="preserve">jopelda.local </w:t>
+      </w:r>
+      <w:r>
+        <w:rPr>
+          <w:rtl w:val="0"/>
+        </w:rPr>
+        <w:t xml:space="preserve">címmel rendelkező domain-t. A DNS szolgáltatást a felhasználók tartományi kezelésére alkalmazzuk.</w:t>
+      </w:r>
+    </w:p>
+    <w:p>
+      <w:pPr>
+        <w:spacing w:after="120" w:line="276" w:lineRule="auto"/>
+        <w:rPr>
+          <w:i w:val="1"/>
+          <w:iCs w:val="1"/>
+          <w:u w:val="single"/>
+        </w:rPr>
+      </w:pPr>
+      <w:r>
+        <w:rPr>
+          <w:i w:val="1"/>
+          <w:iCs w:val="1"/>
+          <w:u w:val="single"/>
+          <w:rtl w:val="0"/>
+        </w:rPr>
+        <w:t xml:space="preserve">Organizational Unit-ok</w:t>
+      </w:r>
+    </w:p>
+    <w:p>
+      <w:pPr>
+        <w:spacing w:after="120" w:line="276" w:lineRule="auto"/>
+        <w:rPr/>
+      </w:pPr>
+      <w:r>
+        <w:rPr>
+          <w:rtl w:val="0"/>
+        </w:rPr>
+        <w:t xml:space="preserve">A hálózatban az egyes telephelyek különböző pozícióiban dolgozó alkalmazottait szeretnénk külön kezelni, ezért létrehoztunk több OU-t is.</w:t>
+      </w:r>
+    </w:p>
+    <w:p>
+      <w:pPr>
+        <w:spacing w:after="120" w:line="276" w:lineRule="auto"/>
+        <w:rPr/>
+      </w:pPr>
+      <w:r>
+        <w:rPr>
+          <w:rtl w:val="0"/>
+        </w:rPr>
+        <w:t xml:space="preserve">A felhasználók közé a cég alkalmazottai lesznek felvéve, a fiókokat vezeteknev.keresztnev felhasználó névvel hoztuk létre.</w:t>
+      </w:r>
+    </w:p>
+    <w:p>
+      <w:pPr>
+        <w:spacing w:after="120" w:line="276" w:lineRule="auto"/>
+        <w:rPr>
+          <w:i w:val="1"/>
+          <w:iCs w:val="1"/>
+          <w:u w:val="single"/>
+        </w:rPr>
+      </w:pPr>
+      <w:r>
+        <w:rPr>
+          <w:i w:val="1"/>
+          <w:iCs w:val="1"/>
+          <w:u w:val="single"/>
+          <w:rtl w:val="0"/>
+        </w:rPr>
+        <w:t xml:space="preserve">Automatizált szoftvertelepítés</w:t>
+      </w:r>
+    </w:p>
+    <w:p>
+      <w:pPr>
+        <w:spacing w:after="120" w:line="276" w:lineRule="auto"/>
+        <w:rPr/>
+      </w:pPr>
+      <w:r>
+        <w:rPr>
+          <w:rtl w:val="0"/>
+        </w:rPr>
+        <w:t xml:space="preserve">Ez egy olyan hasznos funkció, amellyel biztosíthatjuk, hogy a dolgozóknak mindig rendelkezésére álljanak a megfelelő számítógépes programok. Előnye, hogy a telepítendő programot csak a szervereszközre szükséges letölteni, egy .msi kiterjesztésű fájlt kell megosztani, ami aztán automatikusan települni tud a kliens eszközökre a tartományba tartozó felhasználó bejelentkezése után. </w:t>
+      </w:r>
+    </w:p>
+    <w:p>
+      <w:pPr>
+        <w:spacing w:after="120" w:line="276" w:lineRule="auto"/>
+        <w:rPr/>
+      </w:pPr>
+      <w:r>
+        <w:rPr>
+          <w:rtl w:val="0"/>
+        </w:rPr>
+        <w:t xml:space="preserve">Elsőként a Google Chrome böngésző automatikus telepítését beállítottuk. A megosztást a Software Sharing mappára állítottuk be, így később egy helyen lehet rendszerezni a megosztásra szánt szoftvereket.</w:t>
+        <w:br w:type="textWrapping"/>
+      </w:r>
+    </w:p>
+    <w:p>
+      <w:pPr>
+        <w:ind w:left="0" w:firstLine="0"/>
+        <w:rPr/>
+      </w:pPr>
+      <w:r>
+        <w:rPr>
+          <w:rtl w:val="0"/>
+        </w:rPr>
+      </w:r>
+    </w:p>
+    <w:p>
+      <w:pPr>
+        <w:spacing w:line="276" w:lineRule="auto"/>
+        <w:rPr>
+          <w:b w:val="1"/>
+          <w:bCs w:val="1"/>
+        </w:rPr>
+      </w:pPr>
+      <w:r>
+        <w:rPr>
+          <w:b w:val="1"/>
+          <w:bCs w:val="1"/>
+          <w:rtl w:val="0"/>
+        </w:rPr>
+        <w:t xml:space="preserve">Webszerver telepítése és konfigurálása</w:t>
+      </w:r>
+    </w:p>
+    <w:p>
+      <w:pPr>
+        <w:spacing w:line="276" w:lineRule="auto"/>
+        <w:rPr>
+          <w:b w:val="1"/>
+          <w:bCs w:val="1"/>
+        </w:rPr>
+      </w:pPr>
+      <w:r>
+        <w:rPr>
+          <w:rtl w:val="0"/>
+        </w:rPr>
+      </w:r>
+    </w:p>
+    <w:p>
+      <w:pPr>
+        <w:spacing w:line="276" w:lineRule="auto"/>
+        <w:rPr/>
+      </w:pPr>
+      <w:r>
+        <w:rPr>
+          <w:rtl w:val="0"/>
+        </w:rPr>
+        <w:t xml:space="preserve">A rendszerben egy Apache HTTP Server alapú webszerver került megvalósításra Windows Server 2019 operációs rendszeren. A webszerver feladata a vállalati weboldal kiszolgálása.</w:t>
+      </w:r>
+    </w:p>
+    <w:p>
+      <w:pPr>
+        <w:spacing w:line="276" w:lineRule="auto"/>
+        <w:rPr/>
+      </w:pPr>
+      <w:r>
+        <w:rPr>
+          <w:rtl w:val="0"/>
+        </w:rPr>
+      </w:r>
+    </w:p>
+    <w:p>
+      <w:pPr>
+        <w:spacing w:line="276" w:lineRule="auto"/>
+        <w:rPr/>
+      </w:pPr>
+      <w:r>
+        <w:rPr>
+          <w:rtl w:val="0"/>
+        </w:rPr>
+        <w:t xml:space="preserve">Első lépésként letöltésre került az Apache HTTP Server Windows rendszerhez készült változata. A telepítőcsomag kicsomagolása után az Apache fájljai a `C:\Apache24` könyvtárba kerültek. Az Apache konfigurációs fájlja a `C:\Apache24\conf\httpd.conf` elérési úton található.</w:t>
+      </w:r>
+    </w:p>
+    <w:p>
+      <w:pPr>
+        <w:spacing w:line="276" w:lineRule="auto"/>
+        <w:rPr/>
+      </w:pPr>
+      <w:r>
+        <w:rPr>
+          <w:rtl w:val="0"/>
+        </w:rPr>
+        <w:t xml:space="preserve">A konfigurációs fájlban beállításra kerültek a webszerver működéséhez szükséges alapvető paraméterek. A szerver a HTTP protokoll alapértelmezett 80-as TCP portján fogadja a kliensek kéréseit. A weboldal dokumentumgyökere a `C:\Apache24\htdocs` könyvtárra lett beállítva. Ebben a könyvtárban került elhelyezésre a weboldal kezdőlapja, az `index.html` fájl.</w:t>
+      </w:r>
+    </w:p>
+    <w:p>
+      <w:pPr>
+        <w:spacing w:line="276" w:lineRule="auto"/>
+        <w:rPr/>
+      </w:pPr>
+      <w:r>
+        <w:rPr>
+          <w:rtl w:val="0"/>
+        </w:rPr>
+        <w:t xml:space="preserve">A webszerver elkülönített webhelyek kezelésére VirtualHost konfigurációt használ. Ennek segítségével egy szerveren több weboldal is kiszolgálható, akár külön domainnévvel és dokumentumkönyvtárral. A következő konfiguráció egy `www.sajatdomain.hu` nevű webhelyet definiál:</w:t>
+      </w:r>
+    </w:p>
+    <w:p>
+      <w:pPr>
+        <w:spacing w:line="276" w:lineRule="auto"/>
+        <w:rPr/>
+      </w:pPr>
+      <w:r>
+        <w:rPr>
+          <w:rtl w:val="0"/>
+        </w:rPr>
+        <w:t xml:space="preserve">```apache</w:t>
+      </w:r>
+    </w:p>
+    <w:p>
+      <w:pPr>
+        <w:spacing w:line="276" w:lineRule="auto"/>
+        <w:rPr/>
+      </w:pPr>
+      <w:r>
+        <w:rPr>
+          <w:rtl w:val="0"/>
+        </w:rPr>
+        <w:t xml:space="preserve">&lt;VirtualHost *:80&gt;</w:t>
+      </w:r>
+    </w:p>
+    <w:p>
+      <w:pPr>
+        <w:spacing w:line="276" w:lineRule="auto"/>
+        <w:rPr/>
+      </w:pPr>
+      <w:r>
+        <w:rPr>
+          <w:rtl w:val="0"/>
+        </w:rPr>
+        <w:t xml:space="preserve">    ServerName www.sajatdomain.hu</w:t>
+      </w:r>
+    </w:p>
+    <w:p>
+      <w:pPr>
+        <w:spacing w:line="276" w:lineRule="auto"/>
+        <w:rPr/>
+      </w:pPr>
+      <w:r>
+        <w:rPr>
+          <w:rtl w:val="0"/>
+        </w:rPr>
+        <w:t xml:space="preserve">    DocumentRoot "C:/Apache24/htdocs"</w:t>
+      </w:r>
+    </w:p>
+    <w:p>
+      <w:pPr>
+        <w:spacing w:line="276" w:lineRule="auto"/>
+        <w:rPr/>
+      </w:pPr>
+      <w:r>
+        <w:rPr>
+          <w:rtl w:val="0"/>
+        </w:rPr>
+        <w:t xml:space="preserve">    &lt;Directory "C:/Apache24/htdocs"&gt;</w:t>
+      </w:r>
+    </w:p>
+    <w:p>
+      <w:pPr>
+        <w:spacing w:line="276" w:lineRule="auto"/>
+        <w:rPr/>
+      </w:pPr>
+      <w:r>
+        <w:rPr>
+          <w:rtl w:val="0"/>
+        </w:rPr>
+        <w:t xml:space="preserve">        AllowOverride All</w:t>
+      </w:r>
+    </w:p>
+    <w:p>
+      <w:pPr>
+        <w:spacing w:line="276" w:lineRule="auto"/>
+        <w:rPr/>
+      </w:pPr>
+      <w:r>
+        <w:rPr>
+          <w:rtl w:val="0"/>
+        </w:rPr>
+        <w:t xml:space="preserve">        Require all granted</w:t>
+      </w:r>
+    </w:p>
+    <w:p>
+      <w:pPr>
+        <w:spacing w:line="276" w:lineRule="auto"/>
+        <w:rPr/>
+      </w:pPr>
+      <w:r>
+        <w:rPr>
+          <w:rtl w:val="0"/>
+        </w:rPr>
+        <w:t xml:space="preserve">    &lt;/Directory&gt;</w:t>
+      </w:r>
+    </w:p>
+    <w:p>
+      <w:pPr>
+        <w:spacing w:line="276" w:lineRule="auto"/>
+        <w:rPr/>
+      </w:pPr>
+      <w:r>
+        <w:rPr>
+          <w:rtl w:val="0"/>
+        </w:rPr>
+        <w:t xml:space="preserve">    ErrorLog "logs/sajatdomain-error.log"</w:t>
+      </w:r>
+    </w:p>
+    <w:p>
+      <w:pPr>
+        <w:spacing w:line="276" w:lineRule="auto"/>
+        <w:rPr/>
+      </w:pPr>
+      <w:r>
+        <w:rPr>
+          <w:rtl w:val="0"/>
+        </w:rPr>
+        <w:t xml:space="preserve">    CustomLog "logs/sajatdomain-access.log" common</w:t>
+      </w:r>
+    </w:p>
+    <w:p>
+      <w:pPr>
+        <w:spacing w:line="276" w:lineRule="auto"/>
+        <w:rPr/>
+      </w:pPr>
+      <w:r>
+        <w:rPr>
+          <w:rtl w:val="0"/>
+        </w:rPr>
+        <w:t xml:space="preserve">&lt;/VirtualHost&gt;</w:t>
+      </w:r>
+    </w:p>
+    <w:p>
+      <w:pPr>
+        <w:spacing w:line="276" w:lineRule="auto"/>
+        <w:rPr/>
+      </w:pPr>
+      <w:r>
+        <w:rPr>
+          <w:rtl w:val="0"/>
+        </w:rPr>
+        <w:t xml:space="preserve">```</w:t>
+      </w:r>
+    </w:p>
+    <w:p>
+      <w:pPr>
+        <w:spacing w:line="276" w:lineRule="auto"/>
+        <w:rPr/>
+      </w:pPr>
+      <w:r>
+        <w:rPr>
+          <w:rtl w:val="0"/>
+        </w:rPr>
+        <w:t xml:space="preserve">A `ServerName` határozza meg a webhely nevét, a `DocumentRoot` pedig azt a könyvtárat, ahonnan az Apache a weboldal fájljait kiszolgálja. A naplózás is beállításra került. Az Apache külön naplófájlban rögzíti a hibákat és a kliensek által küldött HTTP-kéréseket. Ezek segítségével a későbbi hibakeresés is elvégezhető.</w:t>
+      </w:r>
+    </w:p>
+    <w:p>
+      <w:pPr>
+        <w:spacing w:line="276" w:lineRule="auto"/>
+        <w:rPr/>
+      </w:pPr>
+      <w:r>
+        <w:rPr>
+          <w:rtl w:val="0"/>
+        </w:rPr>
+        <w:t xml:space="preserve">A konfiguráció módosítása után ellenőrzésre került a beállítások helyessége az Apache konfiguráció-ellenőrző parancsával:</w:t>
+      </w:r>
+    </w:p>
+    <w:p>
+      <w:pPr>
+        <w:spacing w:line="276" w:lineRule="auto"/>
+        <w:rPr/>
+      </w:pPr>
+      <w:r>
+        <w:rPr>
+          <w:rtl w:val="0"/>
+        </w:rPr>
+        <w:t xml:space="preserve">```cmd</w:t>
+      </w:r>
+    </w:p>
+    <w:p>
+      <w:pPr>
+        <w:spacing w:line="276" w:lineRule="auto"/>
+        <w:rPr/>
+      </w:pPr>
+      <w:r>
+        <w:rPr>
+          <w:rtl w:val="0"/>
+        </w:rPr>
+        <w:t xml:space="preserve">C:\Apache24\bin\httpd.exe -t</w:t>
+      </w:r>
+    </w:p>
+    <w:p>
+      <w:pPr>
+        <w:spacing w:line="276" w:lineRule="auto"/>
+        <w:rPr/>
+      </w:pPr>
+      <w:r>
+        <w:rPr>
+          <w:rtl w:val="0"/>
+        </w:rPr>
+        <w:t xml:space="preserve">```</w:t>
+      </w:r>
+    </w:p>
+    <w:p>
+      <w:pPr>
+        <w:spacing w:line="276" w:lineRule="auto"/>
+        <w:rPr/>
+      </w:pPr>
+      <w:r>
+        <w:rPr>
+          <w:rtl w:val="0"/>
+        </w:rPr>
+        <w:t xml:space="preserve">Helyes konfiguráció esetén a program a `Syntax OK` üzenetet adja vissza.</w:t>
+      </w:r>
+    </w:p>
+    <w:p>
+      <w:pPr>
+        <w:spacing w:line="276" w:lineRule="auto"/>
+        <w:rPr/>
+      </w:pPr>
+      <w:r>
+        <w:rPr>
+          <w:rtl w:val="0"/>
+        </w:rPr>
+        <w:t xml:space="preserve">Az Apache Windows szolgáltatásként került telepítésre, így a webszerver a Windows Server indulásakor automatikusan elindul.. A szolgáltatás telepítéséhez rendszergazdai jogosultságú parancssorban az alábbi parancs került kiadásra:</w:t>
+      </w:r>
+    </w:p>
+    <w:p>
+      <w:pPr>
+        <w:spacing w:line="276" w:lineRule="auto"/>
+        <w:rPr/>
+      </w:pPr>
+      <w:r>
+        <w:rPr>
+          <w:rtl w:val="0"/>
+        </w:rPr>
+      </w:r>
+    </w:p>
+    <w:p>
+      <w:pPr>
+        <w:spacing w:line="276" w:lineRule="auto"/>
+        <w:rPr/>
+      </w:pPr>
+      <w:r>
+        <w:rPr>
+          <w:rtl w:val="0"/>
+        </w:rPr>
+      </w:r>
+    </w:p>
+    <w:p>
+      <w:pPr>
+        <w:spacing w:line="276" w:lineRule="auto"/>
+        <w:rPr/>
+      </w:pPr>
+      <w:r>
+        <w:rPr>
+          <w:rtl w:val="0"/>
+        </w:rPr>
+      </w:r>
+    </w:p>
+    <w:p>
+      <w:pPr>
+        <w:spacing w:line="276" w:lineRule="auto"/>
+        <w:rPr/>
+      </w:pPr>
+      <w:r>
+        <w:rPr>
+          <w:rtl w:val="0"/>
+        </w:rPr>
+        <w:t xml:space="preserve">C:\Apache24\bin\httpd.exe -k install</w:t>
+      </w:r>
+    </w:p>
+    <w:p>
+      <w:pPr>
+        <w:spacing w:line="276" w:lineRule="auto"/>
+        <w:rPr/>
+      </w:pPr>
+      <w:r>
+        <w:rPr>
+          <w:rtl w:val="0"/>
+        </w:rPr>
+      </w:r>
+    </w:p>
+    <w:p>
+      <w:pPr>
+        <w:spacing w:line="276" w:lineRule="auto"/>
+        <w:rPr/>
+      </w:pPr>
+      <w:r>
+        <w:rPr>
+          <w:rtl w:val="0"/>
+        </w:rPr>
+        <w:t xml:space="preserve">Ezután a szolgáltatás a következő paranccsal indítható el:</w:t>
+      </w:r>
+    </w:p>
+    <w:p>
+      <w:pPr>
+        <w:spacing w:line="276" w:lineRule="auto"/>
+        <w:rPr/>
+      </w:pPr>
+      <w:r>
+        <w:rPr>
+          <w:rtl w:val="0"/>
+        </w:rPr>
+      </w:r>
+    </w:p>
+    <w:p>
+      <w:pPr>
+        <w:spacing w:line="276" w:lineRule="auto"/>
+        <w:rPr/>
+      </w:pPr>
+      <w:r>
+        <w:rPr>
+          <w:rtl w:val="0"/>
+        </w:rPr>
+        <w:t xml:space="preserve">net start Apache2.4</w:t>
+      </w:r>
+    </w:p>
+    <w:p>
+      <w:pPr>
+        <w:spacing w:line="276" w:lineRule="auto"/>
+        <w:rPr/>
+      </w:pPr>
+      <w:r>
+        <w:rPr>
+          <w:rtl w:val="0"/>
+        </w:rPr>
+      </w:r>
+    </w:p>
+    <w:p>
+      <w:pPr>
+        <w:spacing w:line="276" w:lineRule="auto"/>
+        <w:rPr/>
+      </w:pPr>
+      <w:r>
+        <w:rPr>
+          <w:rtl w:val="0"/>
+        </w:rPr>
+        <w:t xml:space="preserve">A működéshez a Windows Defender tűzfalon engedélyezve lett a bejövő TCP kapcsolat a 80-as porton. Erre azért van szükség, hogy a HTTP-kérések eljuthassanak a webszerverhez.</w:t>
+      </w:r>
+    </w:p>
+    <w:p>
+      <w:pPr>
+        <w:spacing w:line="276" w:lineRule="auto"/>
+        <w:rPr/>
+      </w:pPr>
+      <w:r>
+        <w:rPr>
+          <w:rtl w:val="0"/>
+        </w:rPr>
+        <w:t xml:space="preserve">A telepítés és konfiguráció befejezése után egy belső hálózati kliensről böngésző segítségével megnyitásra került a webszerver IP-címe. A teszt során az Apache által kiszolgált weboldal kezdőlapja megfelelően megjelent. Ezzel ellenőrzésre került, hogy a webszerver, a hálózati kapcsolat, a tűzfal és a HTTP szolgáltatás megfelelően működik.</w:t>
       </w:r>
     </w:p>
     <w:p>
@@ -12371,7 +13917,234 @@
 </file>
 
 <file path=word/numbering.xml><?xml version="1.0" encoding="utf-8"?>
-<w:numbering xmlns:mc="http://schemas.openxmlformats.org/markup-compatibility/2006" xmlns:o="urn:schemas-microsoft-com:office:office" xmlns:r="http://schemas.openxmlformats.org/officeDocument/2006/relationships" xmlns:m="http://schemas.openxmlformats.org/officeDocument/2006/math" xmlns:v="urn:schemas-microsoft-com:vml" xmlns:wp="http://schemas.openxmlformats.org/drawingml/2006/wordprocessingDrawing" xmlns:w10="urn:schemas-microsoft-com:office:word" xmlns:w="http://schemas.openxmlformats.org/wordprocessingml/2006/main" xmlns:wne="http://schemas.microsoft.com/office/word/2006/wordml" xmlns:sl="http://schemas.openxmlformats.org/schemaLibrary/2006/main" xmlns:a="http://schemas.openxmlformats.org/drawingml/2006/main" xmlns:pic="http://schemas.openxmlformats.org/drawingml/2006/picture" xmlns:c="http://schemas.openxmlformats.org/drawingml/2006/chart" xmlns:lc="http://schemas.openxmlformats.org/drawingml/2006/lockedCanvas" xmlns:dgm="http://schemas.openxmlformats.org/drawingml/2006/diagram" xmlns:wps="http://schemas.microsoft.com/office/word/2010/wordprocessingShape" xmlns:wpg="http://schemas.microsoft.com/office/word/2010/wordprocessingGroup" xmlns:w14="http://schemas.microsoft.com/office/word/2010/wordml" xmlns:w15="http://schemas.microsoft.com/office/word/2012/wordml" xmlns:w16="http://schemas.microsoft.com/office/word/2018/wordml" xmlns:w16cex="http://schemas.microsoft.com/office/word/2018/wordml/cex" xmlns:w16cid="http://schemas.microsoft.com/office/word/2016/wordml/cid" xmlns="http://schemas.microsoft.com/office/tasks/2019/documenttasks" xmlns:cr="http://schemas.microsoft.com/office/comments/2020/reactions"/>
+<w:numbering xmlns:mc="http://schemas.openxmlformats.org/markup-compatibility/2006" xmlns:o="urn:schemas-microsoft-com:office:office" xmlns:r="http://schemas.openxmlformats.org/officeDocument/2006/relationships" xmlns:m="http://schemas.openxmlformats.org/officeDocument/2006/math" xmlns:v="urn:schemas-microsoft-com:vml" xmlns:wp="http://schemas.openxmlformats.org/drawingml/2006/wordprocessingDrawing" xmlns:w10="urn:schemas-microsoft-com:office:word" xmlns:w="http://schemas.openxmlformats.org/wordprocessingml/2006/main" xmlns:wne="http://schemas.microsoft.com/office/word/2006/wordml" xmlns:sl="http://schemas.openxmlformats.org/schemaLibrary/2006/main" xmlns:a="http://schemas.openxmlformats.org/drawingml/2006/main" xmlns:pic="http://schemas.openxmlformats.org/drawingml/2006/picture" xmlns:c="http://schemas.openxmlformats.org/drawingml/2006/chart" xmlns:lc="http://schemas.openxmlformats.org/drawingml/2006/lockedCanvas" xmlns:dgm="http://schemas.openxmlformats.org/drawingml/2006/diagram" xmlns:wps="http://schemas.microsoft.com/office/word/2010/wordprocessingShape" xmlns:wpg="http://schemas.microsoft.com/office/word/2010/wordprocessingGroup" xmlns:w14="http://schemas.microsoft.com/office/word/2010/wordml" xmlns:w15="http://schemas.microsoft.com/office/word/2012/wordml" xmlns:w16="http://schemas.microsoft.com/office/word/2018/wordml" xmlns:w16cex="http://schemas.microsoft.com/office/word/2018/wordml/cex" xmlns:w16cid="http://schemas.microsoft.com/office/word/2016/wordml/cid" xmlns="http://schemas.microsoft.com/office/tasks/2019/documenttasks" xmlns:cr="http://schemas.microsoft.com/office/comments/2020/reactions">
+  <w:abstractNum w:abstractNumId="1">
+    <w:lvl w:ilvl="0">
+      <w:start w:val="1"/>
+      <w:numFmt w:val="bullet"/>
+      <w:lvlText w:val="●"/>
+      <w:lvlJc w:val="left"/>
+      <w:pPr>
+        <w:ind w:left="720" w:hanging="360"/>
+      </w:pPr>
+      <w:rPr>
+        <w:u w:val="none"/>
+      </w:rPr>
+    </w:lvl>
+    <w:lvl w:ilvl="1">
+      <w:start w:val="1"/>
+      <w:numFmt w:val="bullet"/>
+      <w:lvlText w:val="○"/>
+      <w:lvlJc w:val="left"/>
+      <w:pPr>
+        <w:ind w:left="1440" w:hanging="360"/>
+      </w:pPr>
+      <w:rPr>
+        <w:u w:val="none"/>
+      </w:rPr>
+    </w:lvl>
+    <w:lvl w:ilvl="2">
+      <w:start w:val="1"/>
+      <w:numFmt w:val="bullet"/>
+      <w:lvlText w:val="■"/>
+      <w:lvlJc w:val="left"/>
+      <w:pPr>
+        <w:ind w:left="2160" w:hanging="360"/>
+      </w:pPr>
+      <w:rPr>
+        <w:u w:val="none"/>
+      </w:rPr>
+    </w:lvl>
+    <w:lvl w:ilvl="3">
+      <w:start w:val="1"/>
+      <w:numFmt w:val="bullet"/>
+      <w:lvlText w:val="●"/>
+      <w:lvlJc w:val="left"/>
+      <w:pPr>
+        <w:ind w:left="2880" w:hanging="360"/>
+      </w:pPr>
+      <w:rPr>
+        <w:u w:val="none"/>
+      </w:rPr>
+    </w:lvl>
+    <w:lvl w:ilvl="4">
+      <w:start w:val="1"/>
+      <w:numFmt w:val="bullet"/>
+      <w:lvlText w:val="○"/>
+      <w:lvlJc w:val="left"/>
+      <w:pPr>
+        <w:ind w:left="3600" w:hanging="360"/>
+      </w:pPr>
+      <w:rPr>
+        <w:u w:val="none"/>
+      </w:rPr>
+    </w:lvl>
+    <w:lvl w:ilvl="5">
+      <w:start w:val="1"/>
+      <w:numFmt w:val="bullet"/>
+      <w:lvlText w:val="■"/>
+      <w:lvlJc w:val="left"/>
+      <w:pPr>
+        <w:ind w:left="4320" w:hanging="360"/>
+      </w:pPr>
+      <w:rPr>
+        <w:u w:val="none"/>
+      </w:rPr>
+    </w:lvl>
+    <w:lvl w:ilvl="6">
+      <w:start w:val="1"/>
+      <w:numFmt w:val="bullet"/>
+      <w:lvlText w:val="●"/>
+      <w:lvlJc w:val="left"/>
+      <w:pPr>
+        <w:ind w:left="5040" w:hanging="360"/>
+      </w:pPr>
+      <w:rPr>
+        <w:u w:val="none"/>
+      </w:rPr>
+    </w:lvl>
+    <w:lvl w:ilvl="7">
+      <w:start w:val="1"/>
+      <w:numFmt w:val="bullet"/>
+      <w:lvlText w:val="○"/>
+      <w:lvlJc w:val="left"/>
+      <w:pPr>
+        <w:ind w:left="5760" w:hanging="360"/>
+      </w:pPr>
+      <w:rPr>
+        <w:u w:val="none"/>
+      </w:rPr>
+    </w:lvl>
+    <w:lvl w:ilvl="8">
+      <w:start w:val="1"/>
+      <w:numFmt w:val="bullet"/>
+      <w:lvlText w:val="■"/>
+      <w:lvlJc w:val="left"/>
+      <w:pPr>
+        <w:ind w:left="6480" w:hanging="360"/>
+      </w:pPr>
+      <w:rPr>
+        <w:u w:val="none"/>
+      </w:rPr>
+    </w:lvl>
+  </w:abstractNum>
+  <w:abstractNum w:abstractNumId="2">
+    <w:lvl w:ilvl="0">
+      <w:start w:val="1"/>
+      <w:numFmt w:val="bullet"/>
+      <w:lvlText w:val="●"/>
+      <w:lvlJc w:val="left"/>
+      <w:pPr>
+        <w:ind w:left="720" w:hanging="360"/>
+      </w:pPr>
+      <w:rPr>
+        <w:u w:val="none"/>
+      </w:rPr>
+    </w:lvl>
+    <w:lvl w:ilvl="1">
+      <w:start w:val="1"/>
+      <w:numFmt w:val="bullet"/>
+      <w:lvlText w:val="○"/>
+      <w:lvlJc w:val="left"/>
+      <w:pPr>
+        <w:ind w:left="1440" w:hanging="360"/>
+      </w:pPr>
+      <w:rPr>
+        <w:u w:val="none"/>
+      </w:rPr>
+    </w:lvl>
+    <w:lvl w:ilvl="2">
+      <w:start w:val="1"/>
+      <w:numFmt w:val="bullet"/>
+      <w:lvlText w:val="■"/>
+      <w:lvlJc w:val="left"/>
+      <w:pPr>
+        <w:ind w:left="2160" w:hanging="360"/>
+      </w:pPr>
+      <w:rPr>
+        <w:u w:val="none"/>
+      </w:rPr>
+    </w:lvl>
+    <w:lvl w:ilvl="3">
+      <w:start w:val="1"/>
+      <w:numFmt w:val="bullet"/>
+      <w:lvlText w:val="●"/>
+      <w:lvlJc w:val="left"/>
+      <w:pPr>
+        <w:ind w:left="2880" w:hanging="360"/>
+      </w:pPr>
+      <w:rPr>
+        <w:u w:val="none"/>
+      </w:rPr>
+    </w:lvl>
+    <w:lvl w:ilvl="4">
+      <w:start w:val="1"/>
+      <w:numFmt w:val="bullet"/>
+      <w:lvlText w:val="○"/>
+      <w:lvlJc w:val="left"/>
+      <w:pPr>
+        <w:ind w:left="3600" w:hanging="360"/>
+      </w:pPr>
+      <w:rPr>
+        <w:u w:val="none"/>
+      </w:rPr>
+    </w:lvl>
+    <w:lvl w:ilvl="5">
+      <w:start w:val="1"/>
+      <w:numFmt w:val="bullet"/>
+      <w:lvlText w:val="■"/>
+      <w:lvlJc w:val="left"/>
+      <w:pPr>
+        <w:ind w:left="4320" w:hanging="360"/>
+      </w:pPr>
+      <w:rPr>
+        <w:u w:val="none"/>
+      </w:rPr>
+    </w:lvl>
+    <w:lvl w:ilvl="6">
+      <w:start w:val="1"/>
+      <w:numFmt w:val="bullet"/>
+      <w:lvlText w:val="●"/>
+      <w:lvlJc w:val="left"/>
+      <w:pPr>
+        <w:ind w:left="5040" w:hanging="360"/>
+      </w:pPr>
+      <w:rPr>
+        <w:u w:val="none"/>
+      </w:rPr>
+    </w:lvl>
+    <w:lvl w:ilvl="7">
+      <w:start w:val="1"/>
+      <w:numFmt w:val="bullet"/>
+      <w:lvlText w:val="○"/>
+      <w:lvlJc w:val="left"/>
+      <w:pPr>
+        <w:ind w:left="5760" w:hanging="360"/>
+      </w:pPr>
+      <w:rPr>
+        <w:u w:val="none"/>
+      </w:rPr>
+    </w:lvl>
+    <w:lvl w:ilvl="8">
+      <w:start w:val="1"/>
+      <w:numFmt w:val="bullet"/>
+      <w:lvlText w:val="■"/>
+      <w:lvlJc w:val="left"/>
+      <w:pPr>
+        <w:ind w:left="6480" w:hanging="360"/>
+      </w:pPr>
+      <w:rPr>
+        <w:u w:val="none"/>
+      </w:rPr>
+    </w:lvl>
+  </w:abstractNum>
+  <w:num w:numId="1">
+    <w:abstractNumId w:val="1"/>
+  </w:num>
+  <w:num w:numId="2">
+    <w:abstractNumId w:val="2"/>
+  </w:num>
+</w:numbering>
 </file>
 
 <file path=word/styles.xml><?xml version="1.0" encoding="utf-8"?>

</xml_diff>